<commit_message>
docs: add annotated code printout and sync delivery materials
</commit_message>
<xml_diff>
--- a/交付/个人报告/01-组长-软件项目设计报告.docx
+++ b/交付/个人报告/01-组长-软件项目设计报告.docx
@@ -115,66 +115,17 @@
       </w:r>
     </w:p>
     <w:p>
-      <w:r>
-        <w:br w:type="page"/>
-      </w:r>
-    </w:p>
-    <w:p>
       <w:pPr>
+        <w:pStyle w:val="Heading1"/>
         <w:keepNext/>
+        <w:pageBreakBefore/>
         <w:spacing w:before="200" w:after="120"/>
       </w:pPr>
       <w:r>
         <w:rPr>
           <w:rFonts w:ascii="黑体" w:hAnsi="黑体" w:eastAsia="黑体"/>
           <w:b/>
-          <w:sz w:val="28"/>
-        </w:rPr>
-        <w:t>报告填写说明</w:t>
-      </w:r>
-    </w:p>
-    <w:p>
-      <w:pPr>
-        <w:spacing w:line="360" w:lineRule="auto" w:after="80"/>
-        <w:jc w:val="both"/>
-      </w:pPr>
-      <w:r>
-        <w:rPr>
-          <w:rFonts w:ascii="宋体" w:hAnsi="宋体" w:eastAsia="宋体"/>
-          <w:b w:val="0"/>
-          <w:sz w:val="22"/>
-        </w:rPr>
-        <w:t>本报告依据学校《软件项目设计报告2026年》模板和当前家庭理财系统源码生成。姓名、学号、专业班级和指导教师为占位符，提交前必须替换；个人实现章节按小组责任范围组织，成员应根据真实接手、修改和测试记录确认最终表述。</w:t>
-      </w:r>
-    </w:p>
-    <w:p>
-      <w:pPr>
-        <w:spacing w:line="360" w:lineRule="auto" w:after="80"/>
-        <w:jc w:val="both"/>
-      </w:pPr>
-      <w:r>
-        <w:rPr>
-          <w:rFonts w:ascii="宋体" w:hAnsi="宋体" w:eastAsia="宋体"/>
-          <w:b w:val="0"/>
-          <w:sz w:val="22"/>
-        </w:rPr>
-        <w:t>本报告对应角色：组长；责任范围：需求与架构、数据库、安全认证、家庭与资料、集成验收。</w:t>
-      </w:r>
-    </w:p>
-    <w:p>
-      <w:r>
-        <w:br w:type="page"/>
-      </w:r>
-    </w:p>
-    <w:p>
-      <w:pPr>
-        <w:keepNext/>
-        <w:spacing w:before="200" w:after="120"/>
-      </w:pPr>
-      <w:r>
-        <w:rPr>
-          <w:rFonts w:ascii="黑体" w:hAnsi="黑体" w:eastAsia="黑体"/>
-          <w:b/>
+          <w:color w:val="000000"/>
           <w:sz w:val="28"/>
         </w:rPr>
         <w:t>一、进度计划与可行性分析</w:t>
@@ -182,13 +133,16 @@
     </w:p>
     <w:p>
       <w:pPr>
+        <w:pStyle w:val="Heading2"/>
         <w:keepNext/>
+        <w:pageBreakBefore w:val="0"/>
         <w:spacing w:before="140" w:after="120"/>
       </w:pPr>
       <w:r>
         <w:rPr>
           <w:rFonts w:ascii="黑体" w:hAnsi="黑体" w:eastAsia="黑体"/>
           <w:b/>
+          <w:color w:val="000000"/>
           <w:sz w:val="24"/>
         </w:rPr>
         <w:t>1.1 项目进度计划</w:t>
@@ -216,6 +170,20 @@
         <w:jc w:val="center"/>
         <w:tblLayout w:type="fixed"/>
         <w:tblLook w:firstColumn="1" w:firstRow="1" w:lastColumn="0" w:lastRow="0" w:noHBand="0" w:noVBand="1" w:val="04A0"/>
+        <w:tblBorders>
+          <w:top w:val="single" w:sz="4" w:color="D9D9D9"/>
+          <w:left w:val="single" w:sz="4" w:color="D9D9D9"/>
+          <w:bottom w:val="single" w:sz="4" w:color="D9D9D9"/>
+          <w:right w:val="single" w:sz="4" w:color="D9D9D9"/>
+          <w:insideH w:val="single" w:sz="4" w:color="D9D9D9"/>
+          <w:insideV w:val="single" w:sz="4" w:color="D9D9D9"/>
+        </w:tblBorders>
+        <w:tblCellMar>
+          <w:top w:w="60" w:type="dxa"/>
+          <w:bottom w:w="60" w:type="dxa"/>
+          <w:left w:w="80" w:type="dxa"/>
+          <w:right w:w="80" w:type="dxa"/>
+        </w:tblCellMar>
       </w:tblPr>
       <w:tblGrid>
         <w:gridCol w:w="2209"/>
@@ -236,7 +204,9 @@
           </w:tcPr>
           <w:p>
             <w:pPr>
+              <w:spacing w:line="276" w:lineRule="auto" w:before="0" w:after="0"/>
               <w:jc w:val="center"/>
+              <w:snapToGrid w:val="0"/>
             </w:pPr>
             <w:r>
               <w:rPr>
@@ -256,7 +226,9 @@
           </w:tcPr>
           <w:p>
             <w:pPr>
+              <w:spacing w:line="276" w:lineRule="auto" w:before="0" w:after="0"/>
               <w:jc w:val="center"/>
+              <w:snapToGrid w:val="0"/>
             </w:pPr>
             <w:r>
               <w:rPr>
@@ -276,7 +248,9 @@
           </w:tcPr>
           <w:p>
             <w:pPr>
+              <w:spacing w:line="276" w:lineRule="auto" w:before="0" w:after="0"/>
               <w:jc w:val="center"/>
+              <w:snapToGrid w:val="0"/>
             </w:pPr>
             <w:r>
               <w:rPr>
@@ -296,7 +270,9 @@
           </w:tcPr>
           <w:p>
             <w:pPr>
+              <w:spacing w:line="276" w:lineRule="auto" w:before="0" w:after="0"/>
               <w:jc w:val="center"/>
+              <w:snapToGrid w:val="0"/>
             </w:pPr>
             <w:r>
               <w:rPr>
@@ -320,7 +296,8 @@
           </w:tcPr>
           <w:p>
             <w:pPr>
-              <w:spacing w:after="0"/>
+              <w:spacing w:after="0" w:line="276" w:lineRule="auto" w:before="0"/>
+              <w:snapToGrid w:val="0"/>
             </w:pPr>
             <w:r>
               <w:rPr>
@@ -338,7 +315,8 @@
           </w:tcPr>
           <w:p>
             <w:pPr>
-              <w:spacing w:after="0"/>
+              <w:spacing w:after="0" w:line="276" w:lineRule="auto" w:before="0"/>
+              <w:snapToGrid w:val="0"/>
             </w:pPr>
             <w:r>
               <w:rPr>
@@ -356,7 +334,8 @@
           </w:tcPr>
           <w:p>
             <w:pPr>
-              <w:spacing w:after="0"/>
+              <w:spacing w:after="0" w:line="276" w:lineRule="auto" w:before="0"/>
+              <w:snapToGrid w:val="0"/>
             </w:pPr>
             <w:r>
               <w:rPr>
@@ -374,7 +353,8 @@
           </w:tcPr>
           <w:p>
             <w:pPr>
-              <w:spacing w:after="0"/>
+              <w:spacing w:after="0" w:line="276" w:lineRule="auto" w:before="0"/>
+              <w:snapToGrid w:val="0"/>
             </w:pPr>
             <w:r>
               <w:rPr>
@@ -397,7 +377,8 @@
           </w:tcPr>
           <w:p>
             <w:pPr>
-              <w:spacing w:after="0"/>
+              <w:spacing w:after="0" w:line="276" w:lineRule="auto" w:before="0"/>
+              <w:snapToGrid w:val="0"/>
             </w:pPr>
             <w:r>
               <w:rPr>
@@ -415,14 +396,15 @@
           </w:tcPr>
           <w:p>
             <w:pPr>
-              <w:spacing w:after="0"/>
+              <w:spacing w:after="0" w:line="276" w:lineRule="auto" w:before="0"/>
+              <w:snapToGrid w:val="0"/>
             </w:pPr>
             <w:r>
               <w:rPr>
                 <w:rFonts w:ascii="宋体" w:hAnsi="宋体" w:eastAsia="宋体"/>
                 <w:sz w:val="19"/>
               </w:rPr>
-              <w:t>前后端骨架、四表迁移、配置样例</w:t>
+              <w:t>前后端骨架、八表迁移、配置样例</w:t>
             </w:r>
           </w:p>
         </w:tc>
@@ -433,14 +415,15 @@
           </w:tcPr>
           <w:p>
             <w:pPr>
-              <w:spacing w:after="0"/>
+              <w:spacing w:after="0" w:line="276" w:lineRule="auto" w:before="0"/>
+              <w:snapToGrid w:val="0"/>
             </w:pPr>
             <w:r>
               <w:rPr>
                 <w:rFonts w:ascii="宋体" w:hAnsi="宋体" w:eastAsia="宋体"/>
                 <w:sz w:val="19"/>
               </w:rPr>
-              <w:t>可启动工程、Flyway SQL</w:t>
+              <w:t>V1/V2 Flyway SQL</w:t>
             </w:r>
           </w:p>
         </w:tc>
@@ -451,7 +434,8 @@
           </w:tcPr>
           <w:p>
             <w:pPr>
-              <w:spacing w:after="0"/>
+              <w:spacing w:after="0" w:line="276" w:lineRule="auto" w:before="0"/>
+              <w:snapToGrid w:val="0"/>
             </w:pPr>
             <w:r>
               <w:rPr>
@@ -474,7 +458,8 @@
           </w:tcPr>
           <w:p>
             <w:pPr>
-              <w:spacing w:after="0"/>
+              <w:spacing w:after="0" w:line="276" w:lineRule="auto" w:before="0"/>
+              <w:snapToGrid w:val="0"/>
             </w:pPr>
             <w:r>
               <w:rPr>
@@ -492,7 +477,8 @@
           </w:tcPr>
           <w:p>
             <w:pPr>
-              <w:spacing w:after="0"/>
+              <w:spacing w:after="0" w:line="276" w:lineRule="auto" w:before="0"/>
+              <w:snapToGrid w:val="0"/>
             </w:pPr>
             <w:r>
               <w:rPr>
@@ -510,7 +496,8 @@
           </w:tcPr>
           <w:p>
             <w:pPr>
-              <w:spacing w:after="0"/>
+              <w:spacing w:after="0" w:line="276" w:lineRule="auto" w:before="0"/>
+              <w:snapToGrid w:val="0"/>
             </w:pPr>
             <w:r>
               <w:rPr>
@@ -528,7 +515,8 @@
           </w:tcPr>
           <w:p>
             <w:pPr>
-              <w:spacing w:after="0"/>
+              <w:spacing w:after="0" w:line="276" w:lineRule="auto" w:before="0"/>
+              <w:snapToGrid w:val="0"/>
             </w:pPr>
             <w:r>
               <w:rPr>
@@ -551,7 +539,8 @@
           </w:tcPr>
           <w:p>
             <w:pPr>
-              <w:spacing w:after="0"/>
+              <w:spacing w:after="0" w:line="276" w:lineRule="auto" w:before="0"/>
+              <w:snapToGrid w:val="0"/>
             </w:pPr>
             <w:r>
               <w:rPr>
@@ -569,7 +558,8 @@
           </w:tcPr>
           <w:p>
             <w:pPr>
-              <w:spacing w:after="0"/>
+              <w:spacing w:after="0" w:line="276" w:lineRule="auto" w:before="0"/>
+              <w:snapToGrid w:val="0"/>
             </w:pPr>
             <w:r>
               <w:rPr>
@@ -587,7 +577,8 @@
           </w:tcPr>
           <w:p>
             <w:pPr>
-              <w:spacing w:after="0"/>
+              <w:spacing w:after="0" w:line="276" w:lineRule="auto" w:before="0"/>
+              <w:snapToGrid w:val="0"/>
             </w:pPr>
             <w:r>
               <w:rPr>
@@ -605,7 +596,8 @@
           </w:tcPr>
           <w:p>
             <w:pPr>
-              <w:spacing w:after="0"/>
+              <w:spacing w:after="0" w:line="276" w:lineRule="auto" w:before="0"/>
+              <w:snapToGrid w:val="0"/>
             </w:pPr>
             <w:r>
               <w:rPr>
@@ -628,7 +620,8 @@
           </w:tcPr>
           <w:p>
             <w:pPr>
-              <w:spacing w:after="0"/>
+              <w:spacing w:after="0" w:line="276" w:lineRule="auto" w:before="0"/>
+              <w:snapToGrid w:val="0"/>
             </w:pPr>
             <w:r>
               <w:rPr>
@@ -646,7 +639,8 @@
           </w:tcPr>
           <w:p>
             <w:pPr>
-              <w:spacing w:after="0"/>
+              <w:spacing w:after="0" w:line="276" w:lineRule="auto" w:before="0"/>
+              <w:snapToGrid w:val="0"/>
             </w:pPr>
             <w:r>
               <w:rPr>
@@ -664,7 +658,8 @@
           </w:tcPr>
           <w:p>
             <w:pPr>
-              <w:spacing w:after="0"/>
+              <w:spacing w:after="0" w:line="276" w:lineRule="auto" w:before="0"/>
+              <w:snapToGrid w:val="0"/>
             </w:pPr>
             <w:r>
               <w:rPr>
@@ -682,7 +677,8 @@
           </w:tcPr>
           <w:p>
             <w:pPr>
-              <w:spacing w:after="0"/>
+              <w:spacing w:after="0" w:line="276" w:lineRule="auto" w:before="0"/>
+              <w:snapToGrid w:val="0"/>
             </w:pPr>
             <w:r>
               <w:rPr>
@@ -705,7 +701,89 @@
           </w:tcPr>
           <w:p>
             <w:pPr>
-              <w:spacing w:after="0"/>
+              <w:spacing w:after="0" w:line="276" w:lineRule="auto" w:before="0"/>
+              <w:snapToGrid w:val="0"/>
+            </w:pPr>
+            <w:r>
+              <w:rPr>
+                <w:rFonts w:ascii="宋体" w:hAnsi="宋体" w:eastAsia="宋体"/>
+                <w:sz w:val="19"/>
+              </w:rPr>
+              <w:t>理财扩展</w:t>
+            </w:r>
+          </w:p>
+        </w:tc>
+        <w:tc>
+          <w:tcPr>
+            <w:tcW w:type="dxa" w:w="2952"/>
+            <w:vAlign w:val="center"/>
+          </w:tcPr>
+          <w:p>
+            <w:pPr>
+              <w:spacing w:after="0" w:line="276" w:lineRule="auto" w:before="0"/>
+              <w:snapToGrid w:val="0"/>
+            </w:pPr>
+            <w:r>
+              <w:rPr>
+                <w:rFonts w:ascii="宋体" w:hAnsi="宋体" w:eastAsia="宋体"/>
+                <w:sz w:val="19"/>
+              </w:rPr>
+              <w:t>预算、周期记账、CSV、审计</w:t>
+            </w:r>
+          </w:p>
+        </w:tc>
+        <w:tc>
+          <w:tcPr>
+            <w:tcW w:type="dxa" w:w="2664"/>
+            <w:vAlign w:val="center"/>
+          </w:tcPr>
+          <w:p>
+            <w:pPr>
+              <w:spacing w:after="0" w:line="276" w:lineRule="auto" w:before="0"/>
+              <w:snapToGrid w:val="0"/>
+            </w:pPr>
+            <w:r>
+              <w:rPr>
+                <w:rFonts w:ascii="宋体" w:hAnsi="宋体" w:eastAsia="宋体"/>
+                <w:sz w:val="19"/>
+              </w:rPr>
+              <w:t>新增服务和业务页面</w:t>
+            </w:r>
+          </w:p>
+        </w:tc>
+        <w:tc>
+          <w:tcPr>
+            <w:tcW w:type="dxa" w:w="1296"/>
+            <w:vAlign w:val="center"/>
+          </w:tcPr>
+          <w:p>
+            <w:pPr>
+              <w:spacing w:after="0" w:line="276" w:lineRule="auto" w:before="0"/>
+              <w:snapToGrid w:val="0"/>
+            </w:pPr>
+            <w:r>
+              <w:rPr>
+                <w:rFonts w:ascii="宋体" w:hAnsi="宋体" w:eastAsia="宋体"/>
+                <w:sz w:val="19"/>
+              </w:rPr>
+              <w:t>完成</w:t>
+            </w:r>
+          </w:p>
+        </w:tc>
+      </w:tr>
+      <w:tr>
+        <w:trPr>
+          <w:cantSplit/>
+        </w:trPr>
+        <w:tc>
+          <w:tcPr>
+            <w:tcW w:type="dxa" w:w="1512"/>
+            <w:vAlign w:val="center"/>
+          </w:tcPr>
+          <w:p>
+            <w:pPr>
+              <w:spacing w:after="0" w:line="276" w:lineRule="auto" w:before="0"/>
+              <w:snapToGrid w:val="0"/>
             </w:pPr>
             <w:r>
               <w:rPr>
@@ -723,14 +801,15 @@
           </w:tcPr>
           <w:p>
             <w:pPr>
-              <w:spacing w:after="0"/>
+              <w:spacing w:after="0" w:line="276" w:lineRule="auto" w:before="0"/>
+              <w:snapToGrid w:val="0"/>
             </w:pPr>
             <w:r>
               <w:rPr>
                 <w:rFonts w:ascii="宋体" w:hAnsi="宋体" w:eastAsia="宋体"/>
                 <w:sz w:val="19"/>
               </w:rPr>
-              <w:t>门禁、浏览器验收、文档和截图</w:t>
+              <w:t>门禁证据、真实截图、报告同步</w:t>
             </w:r>
           </w:p>
         </w:tc>
@@ -741,14 +820,15 @@
           </w:tcPr>
           <w:p>
             <w:pPr>
-              <w:spacing w:after="0"/>
+              <w:spacing w:after="0" w:line="276" w:lineRule="auto" w:before="0"/>
+              <w:snapToGrid w:val="0"/>
             </w:pPr>
             <w:r>
               <w:rPr>
                 <w:rFonts w:ascii="宋体" w:hAnsi="宋体" w:eastAsia="宋体"/>
                 <w:sz w:val="19"/>
               </w:rPr>
-              <w:t>验收记录与个人报告</w:t>
+              <w:t>当前版本报告材料</w:t>
             </w:r>
           </w:p>
         </w:tc>
@@ -759,14 +839,15 @@
           </w:tcPr>
           <w:p>
             <w:pPr>
-              <w:spacing w:after="0"/>
+              <w:spacing w:after="0" w:line="276" w:lineRule="auto" w:before="0"/>
+              <w:snapToGrid w:val="0"/>
             </w:pPr>
             <w:r>
               <w:rPr>
                 <w:rFonts w:ascii="宋体" w:hAnsi="宋体" w:eastAsia="宋体"/>
                 <w:sz w:val="19"/>
               </w:rPr>
-              <w:t>进行中</w:t>
+              <w:t>待个人确认</w:t>
             </w:r>
           </w:p>
         </w:tc>
@@ -779,16 +860,19 @@
     </w:p>
     <w:p>
       <w:pPr>
+        <w:pStyle w:val="Heading2"/>
         <w:keepNext/>
+        <w:pageBreakBefore w:val="0"/>
         <w:spacing w:before="140" w:after="120"/>
       </w:pPr>
       <w:r>
         <w:rPr>
           <w:rFonts w:ascii="黑体" w:hAnsi="黑体" w:eastAsia="黑体"/>
           <w:b/>
+          <w:color w:val="000000"/>
           <w:sz w:val="24"/>
         </w:rPr>
-        <w:t>1.2 本人责任范围</w:t>
+        <w:t>1.2 模块责任范围</w:t>
       </w:r>
     </w:p>
     <w:p>
@@ -803,7 +887,7 @@
           <w:b w:val="0"/>
           <w:sz w:val="22"/>
         </w:rPr>
-        <w:t>本人在小组中担任组长，主要负责需求与架构、数据库、安全认证、家庭与资料、集成验收。具体任务如下：</w:t>
+        <w:t>组长报告的模块范围为需求与架构、数据库、安全认证、家庭与资料、集成验收。下表为责任划分，提交前应根据实际参与记录确认个人贡献。</w:t>
       </w:r>
     </w:p>
     <w:tbl>
@@ -813,6 +897,20 @@
         <w:jc w:val="center"/>
         <w:tblLayout w:type="fixed"/>
         <w:tblLook w:firstColumn="1" w:firstRow="1" w:lastColumn="0" w:lastRow="0" w:noHBand="0" w:noVBand="1" w:val="04A0"/>
+        <w:tblBorders>
+          <w:top w:val="single" w:sz="4" w:color="D9D9D9"/>
+          <w:left w:val="single" w:sz="4" w:color="D9D9D9"/>
+          <w:bottom w:val="single" w:sz="4" w:color="D9D9D9"/>
+          <w:right w:val="single" w:sz="4" w:color="D9D9D9"/>
+          <w:insideH w:val="single" w:sz="4" w:color="D9D9D9"/>
+          <w:insideV w:val="single" w:sz="4" w:color="D9D9D9"/>
+        </w:tblBorders>
+        <w:tblCellMar>
+          <w:top w:w="60" w:type="dxa"/>
+          <w:bottom w:w="60" w:type="dxa"/>
+          <w:left w:w="80" w:type="dxa"/>
+          <w:right w:w="80" w:type="dxa"/>
+        </w:tblCellMar>
       </w:tblPr>
       <w:tblGrid>
         <w:gridCol w:w="4419"/>
@@ -831,7 +929,9 @@
           </w:tcPr>
           <w:p>
             <w:pPr>
+              <w:spacing w:line="276" w:lineRule="auto" w:before="0" w:after="0"/>
               <w:jc w:val="center"/>
+              <w:snapToGrid w:val="0"/>
             </w:pPr>
             <w:r>
               <w:rPr>
@@ -851,7 +951,9 @@
           </w:tcPr>
           <w:p>
             <w:pPr>
+              <w:spacing w:line="276" w:lineRule="auto" w:before="0" w:after="0"/>
               <w:jc w:val="center"/>
+              <w:snapToGrid w:val="0"/>
             </w:pPr>
             <w:r>
               <w:rPr>
@@ -875,7 +977,8 @@
           </w:tcPr>
           <w:p>
             <w:pPr>
-              <w:spacing w:after="0"/>
+              <w:spacing w:after="0" w:line="276" w:lineRule="auto" w:before="0"/>
+              <w:snapToGrid w:val="0"/>
             </w:pPr>
             <w:r>
               <w:rPr>
@@ -893,7 +996,8 @@
           </w:tcPr>
           <w:p>
             <w:pPr>
-              <w:spacing w:after="0"/>
+              <w:spacing w:after="0" w:line="276" w:lineRule="auto" w:before="0"/>
+              <w:snapToGrid w:val="0"/>
             </w:pPr>
             <w:r>
               <w:rPr>
@@ -916,7 +1020,8 @@
           </w:tcPr>
           <w:p>
             <w:pPr>
-              <w:spacing w:after="0"/>
+              <w:spacing w:after="0" w:line="276" w:lineRule="auto" w:before="0"/>
+              <w:snapToGrid w:val="0"/>
             </w:pPr>
             <w:r>
               <w:rPr>
@@ -934,14 +1039,15 @@
           </w:tcPr>
           <w:p>
             <w:pPr>
-              <w:spacing w:after="0"/>
+              <w:spacing w:after="0" w:line="276" w:lineRule="auto" w:before="0"/>
+              <w:snapToGrid w:val="0"/>
             </w:pPr>
             <w:r>
               <w:rPr>
                 <w:rFonts w:ascii="宋体" w:hAnsi="宋体" w:eastAsia="宋体"/>
                 <w:sz w:val="19"/>
               </w:rPr>
-              <w:t>设计四张业务表、约束、索引、Flyway 迁移和 demo Profile</w:t>
+              <w:t>核对八张业务表、V1/V2 迁移、约束与 demo Profile</w:t>
             </w:r>
           </w:p>
         </w:tc>
@@ -957,7 +1063,8 @@
           </w:tcPr>
           <w:p>
             <w:pPr>
-              <w:spacing w:after="0"/>
+              <w:spacing w:after="0" w:line="276" w:lineRule="auto" w:before="0"/>
+              <w:snapToGrid w:val="0"/>
             </w:pPr>
             <w:r>
               <w:rPr>
@@ -975,7 +1082,8 @@
           </w:tcPr>
           <w:p>
             <w:pPr>
-              <w:spacing w:after="0"/>
+              <w:spacing w:after="0" w:line="276" w:lineRule="auto" w:before="0"/>
+              <w:snapToGrid w:val="0"/>
             </w:pPr>
             <w:r>
               <w:rPr>
@@ -998,7 +1106,8 @@
           </w:tcPr>
           <w:p>
             <w:pPr>
-              <w:spacing w:after="0"/>
+              <w:spacing w:after="0" w:line="276" w:lineRule="auto" w:before="0"/>
+              <w:snapToGrid w:val="0"/>
             </w:pPr>
             <w:r>
               <w:rPr>
@@ -1016,7 +1125,8 @@
           </w:tcPr>
           <w:p>
             <w:pPr>
-              <w:spacing w:after="0"/>
+              <w:spacing w:after="0" w:line="276" w:lineRule="auto" w:before="0"/>
+              <w:snapToGrid w:val="0"/>
             </w:pPr>
             <w:r>
               <w:rPr>
@@ -1039,7 +1149,8 @@
           </w:tcPr>
           <w:p>
             <w:pPr>
-              <w:spacing w:after="0"/>
+              <w:spacing w:after="0" w:line="276" w:lineRule="auto" w:before="0"/>
+              <w:snapToGrid w:val="0"/>
             </w:pPr>
             <w:r>
               <w:rPr>
@@ -1057,7 +1168,8 @@
           </w:tcPr>
           <w:p>
             <w:pPr>
-              <w:spacing w:after="0"/>
+              <w:spacing w:after="0" w:line="276" w:lineRule="auto" w:before="0"/>
+              <w:snapToGrid w:val="0"/>
             </w:pPr>
             <w:r>
               <w:rPr>
@@ -1077,13 +1189,16 @@
     </w:p>
     <w:p>
       <w:pPr>
+        <w:pStyle w:val="Heading2"/>
         <w:keepNext/>
+        <w:pageBreakBefore w:val="0"/>
         <w:spacing w:before="140" w:after="120"/>
       </w:pPr>
       <w:r>
         <w:rPr>
           <w:rFonts w:ascii="黑体" w:hAnsi="黑体" w:eastAsia="黑体"/>
           <w:b/>
+          <w:color w:val="000000"/>
           <w:sz w:val="24"/>
         </w:rPr>
         <w:t>1.3 可行性分析</w:t>
@@ -1151,16 +1266,19 @@
     </w:p>
     <w:p>
       <w:pPr>
+        <w:pStyle w:val="Heading2"/>
         <w:keepNext/>
+        <w:pageBreakBefore w:val="0"/>
         <w:spacing w:before="140" w:after="120"/>
       </w:pPr>
       <w:r>
         <w:rPr>
           <w:rFonts w:ascii="黑体" w:hAnsi="黑体" w:eastAsia="黑体"/>
           <w:b/>
+          <w:color w:val="000000"/>
           <w:sz w:val="24"/>
         </w:rPr>
-        <w:t>1.4 技术现状与趋势</w:t>
+        <w:t>1.4 技术取舍</w:t>
       </w:r>
     </w:p>
     <w:p>
@@ -1175,23 +1293,21 @@
           <w:b w:val="0"/>
           <w:sz w:val="22"/>
         </w:rPr>
-        <w:t>当前 Web 管理类系统普遍采用前后端分离、组件化界面、服务端统一鉴权和自动化构建。家庭记账类应用的发展重点从单纯流水记录转向多成员协作、可视化统计、隐私隔离和移动端体验。本课设选择其中最能体现软件工程能力的身份、权限、CRUD、统计和响应式功能，不接入真实金融账户。</w:t>
-      </w:r>
-    </w:p>
-    <w:p>
-      <w:r>
-        <w:br w:type="page"/>
+        <w:t>本项目选择前后端分离、组件化界面、服务端鉴权和自动化构建。核心功能覆盖家庭协作、权限隔离、流水与统计，扩展功能补充预算计划、批量数据交换和重复记账。仍采用单体后端与关系数据库，不接入真实金融账户，不引入没有当前需求的微服务和消息队列。</w:t>
       </w:r>
     </w:p>
     <w:p>
       <w:pPr>
+        <w:pStyle w:val="Heading1"/>
         <w:keepNext/>
+        <w:pageBreakBefore w:val="0"/>
         <w:spacing w:before="200" w:after="120"/>
       </w:pPr>
       <w:r>
         <w:rPr>
           <w:rFonts w:ascii="黑体" w:hAnsi="黑体" w:eastAsia="黑体"/>
           <w:b/>
+          <w:color w:val="000000"/>
           <w:sz w:val="28"/>
         </w:rPr>
         <w:t>二、需求分析</w:t>
@@ -1199,13 +1315,16 @@
     </w:p>
     <w:p>
       <w:pPr>
+        <w:pStyle w:val="Heading2"/>
         <w:keepNext/>
+        <w:pageBreakBefore w:val="0"/>
         <w:spacing w:before="140" w:after="120"/>
       </w:pPr>
       <w:r>
         <w:rPr>
           <w:rFonts w:ascii="黑体" w:hAnsi="黑体" w:eastAsia="黑体"/>
           <w:b/>
+          <w:color w:val="000000"/>
           <w:sz w:val="24"/>
         </w:rPr>
         <w:t>2.1 用户角色</w:t>
@@ -1218,6 +1337,20 @@
         <w:jc w:val="center"/>
         <w:tblLayout w:type="fixed"/>
         <w:tblLook w:firstColumn="1" w:firstRow="1" w:lastColumn="0" w:lastRow="0" w:noHBand="0" w:noVBand="1" w:val="04A0"/>
+        <w:tblBorders>
+          <w:top w:val="single" w:sz="4" w:color="D9D9D9"/>
+          <w:left w:val="single" w:sz="4" w:color="D9D9D9"/>
+          <w:bottom w:val="single" w:sz="4" w:color="D9D9D9"/>
+          <w:right w:val="single" w:sz="4" w:color="D9D9D9"/>
+          <w:insideH w:val="single" w:sz="4" w:color="D9D9D9"/>
+          <w:insideV w:val="single" w:sz="4" w:color="D9D9D9"/>
+        </w:tblBorders>
+        <w:tblCellMar>
+          <w:top w:w="60" w:type="dxa"/>
+          <w:bottom w:w="60" w:type="dxa"/>
+          <w:left w:w="80" w:type="dxa"/>
+          <w:right w:w="80" w:type="dxa"/>
+        </w:tblCellMar>
       </w:tblPr>
       <w:tblGrid>
         <w:gridCol w:w="2946"/>
@@ -1237,7 +1370,9 @@
           </w:tcPr>
           <w:p>
             <w:pPr>
+              <w:spacing w:line="276" w:lineRule="auto" w:before="0" w:after="0"/>
               <w:jc w:val="center"/>
+              <w:snapToGrid w:val="0"/>
             </w:pPr>
             <w:r>
               <w:rPr>
@@ -1257,7 +1392,9 @@
           </w:tcPr>
           <w:p>
             <w:pPr>
+              <w:spacing w:line="276" w:lineRule="auto" w:before="0" w:after="0"/>
               <w:jc w:val="center"/>
+              <w:snapToGrid w:val="0"/>
             </w:pPr>
             <w:r>
               <w:rPr>
@@ -1277,7 +1414,9 @@
           </w:tcPr>
           <w:p>
             <w:pPr>
+              <w:spacing w:line="276" w:lineRule="auto" w:before="0" w:after="0"/>
               <w:jc w:val="center"/>
+              <w:snapToGrid w:val="0"/>
             </w:pPr>
             <w:r>
               <w:rPr>
@@ -1301,7 +1440,8 @@
           </w:tcPr>
           <w:p>
             <w:pPr>
-              <w:spacing w:after="0"/>
+              <w:spacing w:after="0" w:line="276" w:lineRule="auto" w:before="0"/>
+              <w:snapToGrid w:val="0"/>
             </w:pPr>
             <w:r>
               <w:rPr>
@@ -1319,7 +1459,8 @@
           </w:tcPr>
           <w:p>
             <w:pPr>
-              <w:spacing w:after="0"/>
+              <w:spacing w:after="0" w:line="276" w:lineRule="auto" w:before="0"/>
+              <w:snapToGrid w:val="0"/>
             </w:pPr>
             <w:r>
               <w:rPr>
@@ -1337,7 +1478,8 @@
           </w:tcPr>
           <w:p>
             <w:pPr>
-              <w:spacing w:after="0"/>
+              <w:spacing w:after="0" w:line="276" w:lineRule="auto" w:before="0"/>
+              <w:snapToGrid w:val="0"/>
             </w:pPr>
             <w:r>
               <w:rPr>
@@ -1360,7 +1502,8 @@
           </w:tcPr>
           <w:p>
             <w:pPr>
-              <w:spacing w:after="0"/>
+              <w:spacing w:after="0" w:line="276" w:lineRule="auto" w:before="0"/>
+              <w:snapToGrid w:val="0"/>
             </w:pPr>
             <w:r>
               <w:rPr>
@@ -1378,7 +1521,8 @@
           </w:tcPr>
           <w:p>
             <w:pPr>
-              <w:spacing w:after="0"/>
+              <w:spacing w:after="0" w:line="276" w:lineRule="auto" w:before="0"/>
+              <w:snapToGrid w:val="0"/>
             </w:pPr>
             <w:r>
               <w:rPr>
@@ -1396,7 +1540,8 @@
           </w:tcPr>
           <w:p>
             <w:pPr>
-              <w:spacing w:after="0"/>
+              <w:spacing w:after="0" w:line="276" w:lineRule="auto" w:before="0"/>
+              <w:snapToGrid w:val="0"/>
             </w:pPr>
             <w:r>
               <w:rPr>
@@ -1419,7 +1564,8 @@
           </w:tcPr>
           <w:p>
             <w:pPr>
-              <w:spacing w:after="0"/>
+              <w:spacing w:after="0" w:line="276" w:lineRule="auto" w:before="0"/>
+              <w:snapToGrid w:val="0"/>
             </w:pPr>
             <w:r>
               <w:rPr>
@@ -1437,7 +1583,8 @@
           </w:tcPr>
           <w:p>
             <w:pPr>
-              <w:spacing w:after="0"/>
+              <w:spacing w:after="0" w:line="276" w:lineRule="auto" w:before="0"/>
+              <w:snapToGrid w:val="0"/>
             </w:pPr>
             <w:r>
               <w:rPr>
@@ -1455,14 +1602,15 @@
           </w:tcPr>
           <w:p>
             <w:pPr>
-              <w:spacing w:after="0"/>
+              <w:spacing w:after="0" w:line="276" w:lineRule="auto" w:before="0"/>
+              <w:snapToGrid w:val="0"/>
             </w:pPr>
             <w:r>
               <w:rPr>
                 <w:rFonts w:ascii="宋体" w:hAnsi="宋体" w:eastAsia="宋体"/>
                 <w:sz w:val="19"/>
               </w:rPr>
-              <w:t>维护成员、家庭分类、邀请码和全家流水</w:t>
+              <w:t>维护成员、分类、全家流水与预算，查看审计日志</w:t>
             </w:r>
           </w:p>
         </w:tc>
@@ -1475,13 +1623,16 @@
     </w:p>
     <w:p>
       <w:pPr>
+        <w:pStyle w:val="Heading2"/>
         <w:keepNext/>
+        <w:pageBreakBefore w:val="0"/>
         <w:spacing w:before="140" w:after="120"/>
       </w:pPr>
       <w:r>
         <w:rPr>
           <w:rFonts w:ascii="黑体" w:hAnsi="黑体" w:eastAsia="黑体"/>
           <w:b/>
+          <w:color w:val="000000"/>
           <w:sz w:val="24"/>
         </w:rPr>
         <w:t>2.2 功能需求</w:t>
@@ -1489,7 +1640,7 @@
     </w:p>
     <w:p>
       <w:pPr>
-        <w:spacing w:line="360" w:lineRule="auto"/>
+        <w:spacing w:line="360" w:lineRule="auto" w:after="60"/>
         <w:ind w:left="440" w:hanging="220"/>
       </w:pPr>
       <w:r>
@@ -1502,7 +1653,7 @@
     </w:p>
     <w:p>
       <w:pPr>
-        <w:spacing w:line="360" w:lineRule="auto"/>
+        <w:spacing w:line="360" w:lineRule="auto" w:after="60"/>
         <w:ind w:left="440" w:hanging="220"/>
       </w:pPr>
       <w:r>
@@ -1515,7 +1666,7 @@
     </w:p>
     <w:p>
       <w:pPr>
-        <w:spacing w:line="360" w:lineRule="auto"/>
+        <w:spacing w:line="360" w:lineRule="auto" w:after="60"/>
         <w:ind w:left="440" w:hanging="220"/>
       </w:pPr>
       <w:r>
@@ -1528,7 +1679,7 @@
     </w:p>
     <w:p>
       <w:pPr>
-        <w:spacing w:line="360" w:lineRule="auto"/>
+        <w:spacing w:line="360" w:lineRule="auto" w:after="60"/>
         <w:ind w:left="440" w:hanging="220"/>
       </w:pPr>
       <w:r>
@@ -1541,7 +1692,7 @@
     </w:p>
     <w:p>
       <w:pPr>
-        <w:spacing w:line="360" w:lineRule="auto"/>
+        <w:spacing w:line="360" w:lineRule="auto" w:after="60"/>
         <w:ind w:left="440" w:hanging="220"/>
       </w:pPr>
       <w:r>
@@ -1554,7 +1705,7 @@
     </w:p>
     <w:p>
       <w:pPr>
-        <w:spacing w:line="360" w:lineRule="auto"/>
+        <w:spacing w:line="360" w:lineRule="auto" w:after="60"/>
         <w:ind w:left="440" w:hanging="220"/>
       </w:pPr>
       <w:r>
@@ -1567,13 +1718,68 @@
     </w:p>
     <w:p>
       <w:pPr>
+        <w:spacing w:line="360" w:lineRule="auto" w:after="60"/>
+        <w:ind w:left="440" w:hanging="220"/>
+      </w:pPr>
+      <w:r>
+        <w:rPr>
+          <w:rFonts w:ascii="宋体" w:hAnsi="宋体" w:eastAsia="宋体"/>
+          <w:sz w:val="22"/>
+        </w:rPr>
+        <w:t>• 预算：月度总预算与分类预算，展示已用、剩余、使用率和超支状态。</w:t>
+      </w:r>
+    </w:p>
+    <w:p>
+      <w:pPr>
+        <w:spacing w:line="360" w:lineRule="auto" w:after="60"/>
+        <w:ind w:left="440" w:hanging="220"/>
+      </w:pPr>
+      <w:r>
+        <w:rPr>
+          <w:rFonts w:ascii="宋体" w:hAnsi="宋体" w:eastAsia="宋体"/>
+          <w:sz w:val="22"/>
+        </w:rPr>
+        <w:t>• 数据交换：按权限导出 CSV；导入先预览字段和逐行错误，通过后整批提交。</w:t>
+      </w:r>
+    </w:p>
+    <w:p>
+      <w:pPr>
+        <w:spacing w:line="360" w:lineRule="auto" w:after="60"/>
+        <w:ind w:left="440" w:hanging="220"/>
+      </w:pPr>
+      <w:r>
+        <w:rPr>
+          <w:rFonts w:ascii="宋体" w:hAnsi="宋体" w:eastAsia="宋体"/>
+          <w:sz w:val="22"/>
+        </w:rPr>
+        <w:t>• 周期记账：维护重复收支模板，手动按月生成到期流水，防止同月重复生成。</w:t>
+      </w:r>
+    </w:p>
+    <w:p>
+      <w:pPr>
+        <w:spacing w:line="360" w:lineRule="auto" w:after="60"/>
+        <w:ind w:left="440" w:hanging="220"/>
+      </w:pPr>
+      <w:r>
+        <w:rPr>
+          <w:rFonts w:ascii="宋体" w:hAnsi="宋体" w:eastAsia="宋体"/>
+          <w:sz w:val="22"/>
+        </w:rPr>
+        <w:t>• 统计增强与审计：等长上期环比、储蓄率、异常提示、月度报告；家长查看操作日志。</w:t>
+      </w:r>
+    </w:p>
+    <w:p>
+      <w:pPr>
+        <w:pStyle w:val="Heading2"/>
         <w:keepNext/>
+        <w:pageBreakBefore w:val="0"/>
         <w:spacing w:before="140" w:after="120"/>
       </w:pPr>
       <w:r>
         <w:rPr>
           <w:rFonts w:ascii="黑体" w:hAnsi="黑体" w:eastAsia="黑体"/>
           <w:b/>
+          <w:color w:val="000000"/>
           <w:sz w:val="24"/>
         </w:rPr>
         <w:t>2.3 核心业务规则</w:t>
@@ -1581,7 +1787,7 @@
     </w:p>
     <w:p>
       <w:pPr>
-        <w:spacing w:line="360" w:lineRule="auto"/>
+        <w:spacing w:line="360" w:lineRule="auto" w:after="60"/>
         <w:ind w:left="440" w:hanging="220"/>
       </w:pPr>
       <w:r>
@@ -1594,7 +1800,7 @@
     </w:p>
     <w:p>
       <w:pPr>
-        <w:spacing w:line="360" w:lineRule="auto"/>
+        <w:spacing w:line="360" w:lineRule="auto" w:after="60"/>
         <w:ind w:left="440" w:hanging="220"/>
       </w:pPr>
       <w:r>
@@ -1607,7 +1813,7 @@
     </w:p>
     <w:p>
       <w:pPr>
-        <w:spacing w:line="360" w:lineRule="auto"/>
+        <w:spacing w:line="360" w:lineRule="auto" w:after="60"/>
         <w:ind w:left="440" w:hanging="220"/>
       </w:pPr>
       <w:r>
@@ -1620,7 +1826,7 @@
     </w:p>
     <w:p>
       <w:pPr>
-        <w:spacing w:line="360" w:lineRule="auto"/>
+        <w:spacing w:line="360" w:lineRule="auto" w:after="60"/>
         <w:ind w:left="440" w:hanging="220"/>
       </w:pPr>
       <w:r>
@@ -1633,7 +1839,7 @@
     </w:p>
     <w:p>
       <w:pPr>
-        <w:spacing w:line="360" w:lineRule="auto"/>
+        <w:spacing w:line="360" w:lineRule="auto" w:after="60"/>
         <w:ind w:left="440" w:hanging="220"/>
       </w:pPr>
       <w:r>
@@ -1646,7 +1852,7 @@
     </w:p>
     <w:p>
       <w:pPr>
-        <w:spacing w:line="360" w:lineRule="auto"/>
+        <w:spacing w:line="360" w:lineRule="auto" w:after="60"/>
         <w:ind w:left="440" w:hanging="220"/>
       </w:pPr>
       <w:r>
@@ -1659,13 +1865,42 @@
     </w:p>
     <w:p>
       <w:pPr>
+        <w:spacing w:line="360" w:lineRule="auto" w:after="60"/>
+        <w:ind w:left="440" w:hanging="220"/>
+      </w:pPr>
+      <w:r>
+        <w:rPr>
+          <w:rFonts w:ascii="宋体" w:hAnsi="宋体" w:eastAsia="宋体"/>
+          <w:sz w:val="22"/>
+        </w:rPr>
+        <w:t>• 预算只允许家长修改，普通成员可以查看；CSV 和周期模板沿用家长全家、成员本人的数据边界。</w:t>
+      </w:r>
+    </w:p>
+    <w:p>
+      <w:pPr>
+        <w:spacing w:line="360" w:lineRule="auto" w:after="60"/>
+        <w:ind w:left="440" w:hanging="220"/>
+      </w:pPr>
+      <w:r>
+        <w:rPr>
+          <w:rFonts w:ascii="宋体" w:hAnsi="宋体" w:eastAsia="宋体"/>
+          <w:sz w:val="22"/>
+        </w:rPr>
+        <w:t>• 周期生成由用户触发，不是后台自动扣款；同一模板同一月份只生成一次。</w:t>
+      </w:r>
+    </w:p>
+    <w:p>
+      <w:pPr>
+        <w:pStyle w:val="Heading2"/>
         <w:keepNext/>
+        <w:pageBreakBefore w:val="0"/>
         <w:spacing w:before="140" w:after="120"/>
       </w:pPr>
       <w:r>
         <w:rPr>
           <w:rFonts w:ascii="黑体" w:hAnsi="黑体" w:eastAsia="黑体"/>
           <w:b/>
+          <w:color w:val="000000"/>
           <w:sz w:val="24"/>
         </w:rPr>
         <w:t>2.4 非功能需求</w:t>
@@ -1688,16 +1923,19 @@
     </w:p>
     <w:p>
       <w:pPr>
+        <w:pStyle w:val="Heading2"/>
         <w:keepNext/>
+        <w:pageBreakBefore w:val="0"/>
         <w:spacing w:before="140" w:after="120"/>
       </w:pPr>
       <w:r>
         <w:rPr>
           <w:rFonts w:ascii="黑体" w:hAnsi="黑体" w:eastAsia="黑体"/>
           <w:b/>
+          <w:color w:val="000000"/>
           <w:sz w:val="24"/>
         </w:rPr>
-        <w:t>2.5 本人模块验收标准</w:t>
+        <w:t>2.5 模块验收标准</w:t>
       </w:r>
     </w:p>
     <w:p>
@@ -1712,23 +1950,21 @@
           <w:b w:val="0"/>
           <w:sz w:val="22"/>
         </w:rPr>
-        <w:t>本人负责的需求与架构、数据库、安全认证、家庭与资料、集成验收必须与统一接口契约一致，既能完成正常动线，也能正确拒绝越权、无效输入和冲突操作；相关源码、测试、构建和最终页面应相互对应。</w:t>
-      </w:r>
-    </w:p>
-    <w:p>
-      <w:r>
-        <w:br w:type="page"/>
+        <w:t>需求与架构、数据库、安全认证、家庭与资料、集成验收必须与统一接口契约一致，既能完成正常动线，也应拒绝越权、无效输入和冲突操作。成员删除以停用替代物理删除，保留历史账目；收入与支出构成通过分类和流水共同维护。此业务解释及 Spring Boot 对任务书 JavaEE 技术要求的对应关系应在课程验收时确认。</w:t>
       </w:r>
     </w:p>
     <w:p>
       <w:pPr>
+        <w:pStyle w:val="Heading1"/>
         <w:keepNext/>
+        <w:pageBreakBefore w:val="0"/>
         <w:spacing w:before="200" w:after="120"/>
       </w:pPr>
       <w:r>
         <w:rPr>
           <w:rFonts w:ascii="黑体" w:hAnsi="黑体" w:eastAsia="黑体"/>
           <w:b/>
+          <w:color w:val="000000"/>
           <w:sz w:val="28"/>
         </w:rPr>
         <w:t>三、总体设计</w:t>
@@ -1736,13 +1972,16 @@
     </w:p>
     <w:p>
       <w:pPr>
+        <w:pStyle w:val="Heading2"/>
         <w:keepNext/>
+        <w:pageBreakBefore w:val="0"/>
         <w:spacing w:before="140" w:after="120"/>
       </w:pPr>
       <w:r>
         <w:rPr>
           <w:rFonts w:ascii="黑体" w:hAnsi="黑体" w:eastAsia="黑体"/>
           <w:b/>
+          <w:color w:val="000000"/>
           <w:sz w:val="24"/>
         </w:rPr>
         <w:t>3.1 开发工具与运行平台</w:t>
@@ -1755,6 +1994,20 @@
         <w:jc w:val="center"/>
         <w:tblLayout w:type="fixed"/>
         <w:tblLook w:firstColumn="1" w:firstRow="1" w:lastColumn="0" w:lastRow="0" w:noHBand="0" w:noVBand="1" w:val="04A0"/>
+        <w:tblBorders>
+          <w:top w:val="single" w:sz="4" w:color="D9D9D9"/>
+          <w:left w:val="single" w:sz="4" w:color="D9D9D9"/>
+          <w:bottom w:val="single" w:sz="4" w:color="D9D9D9"/>
+          <w:right w:val="single" w:sz="4" w:color="D9D9D9"/>
+          <w:insideH w:val="single" w:sz="4" w:color="D9D9D9"/>
+          <w:insideV w:val="single" w:sz="4" w:color="D9D9D9"/>
+        </w:tblBorders>
+        <w:tblCellMar>
+          <w:top w:w="60" w:type="dxa"/>
+          <w:bottom w:w="60" w:type="dxa"/>
+          <w:left w:w="80" w:type="dxa"/>
+          <w:right w:w="80" w:type="dxa"/>
+        </w:tblCellMar>
       </w:tblPr>
       <w:tblGrid>
         <w:gridCol w:w="2946"/>
@@ -1774,7 +2027,9 @@
           </w:tcPr>
           <w:p>
             <w:pPr>
+              <w:spacing w:line="276" w:lineRule="auto" w:before="0" w:after="0"/>
               <w:jc w:val="center"/>
+              <w:snapToGrid w:val="0"/>
             </w:pPr>
             <w:r>
               <w:rPr>
@@ -1794,7 +2049,9 @@
           </w:tcPr>
           <w:p>
             <w:pPr>
+              <w:spacing w:line="276" w:lineRule="auto" w:before="0" w:after="0"/>
               <w:jc w:val="center"/>
+              <w:snapToGrid w:val="0"/>
             </w:pPr>
             <w:r>
               <w:rPr>
@@ -1814,7 +2071,9 @@
           </w:tcPr>
           <w:p>
             <w:pPr>
+              <w:spacing w:line="276" w:lineRule="auto" w:before="0" w:after="0"/>
               <w:jc w:val="center"/>
+              <w:snapToGrid w:val="0"/>
             </w:pPr>
             <w:r>
               <w:rPr>
@@ -1838,7 +2097,8 @@
           </w:tcPr>
           <w:p>
             <w:pPr>
-              <w:spacing w:after="0"/>
+              <w:spacing w:after="0" w:line="276" w:lineRule="auto" w:before="0"/>
+              <w:snapToGrid w:val="0"/>
             </w:pPr>
             <w:r>
               <w:rPr>
@@ -1856,7 +2116,8 @@
           </w:tcPr>
           <w:p>
             <w:pPr>
-              <w:spacing w:after="0"/>
+              <w:spacing w:after="0" w:line="276" w:lineRule="auto" w:before="0"/>
+              <w:snapToGrid w:val="0"/>
             </w:pPr>
             <w:r>
               <w:rPr>
@@ -1874,7 +2135,8 @@
           </w:tcPr>
           <w:p>
             <w:pPr>
-              <w:spacing w:after="0"/>
+              <w:spacing w:after="0" w:line="276" w:lineRule="auto" w:before="0"/>
+              <w:snapToGrid w:val="0"/>
             </w:pPr>
             <w:r>
               <w:rPr>
@@ -1897,7 +2159,8 @@
           </w:tcPr>
           <w:p>
             <w:pPr>
-              <w:spacing w:after="0"/>
+              <w:spacing w:after="0" w:line="276" w:lineRule="auto" w:before="0"/>
+              <w:snapToGrid w:val="0"/>
             </w:pPr>
             <w:r>
               <w:rPr>
@@ -1915,7 +2178,8 @@
           </w:tcPr>
           <w:p>
             <w:pPr>
-              <w:spacing w:after="0"/>
+              <w:spacing w:after="0" w:line="276" w:lineRule="auto" w:before="0"/>
+              <w:snapToGrid w:val="0"/>
             </w:pPr>
             <w:r>
               <w:rPr>
@@ -1933,7 +2197,8 @@
           </w:tcPr>
           <w:p>
             <w:pPr>
-              <w:spacing w:after="0"/>
+              <w:spacing w:after="0" w:line="276" w:lineRule="auto" w:before="0"/>
+              <w:snapToGrid w:val="0"/>
             </w:pPr>
             <w:r>
               <w:rPr>
@@ -1956,7 +2221,8 @@
           </w:tcPr>
           <w:p>
             <w:pPr>
-              <w:spacing w:after="0"/>
+              <w:spacing w:after="0" w:line="276" w:lineRule="auto" w:before="0"/>
+              <w:snapToGrid w:val="0"/>
             </w:pPr>
             <w:r>
               <w:rPr>
@@ -1974,7 +2240,8 @@
           </w:tcPr>
           <w:p>
             <w:pPr>
-              <w:spacing w:after="0"/>
+              <w:spacing w:after="0" w:line="276" w:lineRule="auto" w:before="0"/>
+              <w:snapToGrid w:val="0"/>
             </w:pPr>
             <w:r>
               <w:rPr>
@@ -1992,7 +2259,8 @@
           </w:tcPr>
           <w:p>
             <w:pPr>
-              <w:spacing w:after="0"/>
+              <w:spacing w:after="0" w:line="276" w:lineRule="auto" w:before="0"/>
+              <w:snapToGrid w:val="0"/>
             </w:pPr>
             <w:r>
               <w:rPr>
@@ -2015,7 +2283,8 @@
           </w:tcPr>
           <w:p>
             <w:pPr>
-              <w:spacing w:after="0"/>
+              <w:spacing w:after="0" w:line="276" w:lineRule="auto" w:before="0"/>
+              <w:snapToGrid w:val="0"/>
             </w:pPr>
             <w:r>
               <w:rPr>
@@ -2033,7 +2302,8 @@
           </w:tcPr>
           <w:p>
             <w:pPr>
-              <w:spacing w:after="0"/>
+              <w:spacing w:after="0" w:line="276" w:lineRule="auto" w:before="0"/>
+              <w:snapToGrid w:val="0"/>
             </w:pPr>
             <w:r>
               <w:rPr>
@@ -2051,7 +2321,8 @@
           </w:tcPr>
           <w:p>
             <w:pPr>
-              <w:spacing w:after="0"/>
+              <w:spacing w:after="0" w:line="276" w:lineRule="auto" w:before="0"/>
+              <w:snapToGrid w:val="0"/>
             </w:pPr>
             <w:r>
               <w:rPr>
@@ -2074,7 +2345,8 @@
           </w:tcPr>
           <w:p>
             <w:pPr>
-              <w:spacing w:after="0"/>
+              <w:spacing w:after="0" w:line="276" w:lineRule="auto" w:before="0"/>
+              <w:snapToGrid w:val="0"/>
             </w:pPr>
             <w:r>
               <w:rPr>
@@ -2092,7 +2364,8 @@
           </w:tcPr>
           <w:p>
             <w:pPr>
-              <w:spacing w:after="0"/>
+              <w:spacing w:after="0" w:line="276" w:lineRule="auto" w:before="0"/>
+              <w:snapToGrid w:val="0"/>
             </w:pPr>
             <w:r>
               <w:rPr>
@@ -2110,7 +2383,8 @@
           </w:tcPr>
           <w:p>
             <w:pPr>
-              <w:spacing w:after="0"/>
+              <w:spacing w:after="0" w:line="276" w:lineRule="auto" w:before="0"/>
+              <w:snapToGrid w:val="0"/>
             </w:pPr>
             <w:r>
               <w:rPr>
@@ -2133,7 +2407,8 @@
           </w:tcPr>
           <w:p>
             <w:pPr>
-              <w:spacing w:after="0"/>
+              <w:spacing w:after="0" w:line="276" w:lineRule="auto" w:before="0"/>
+              <w:snapToGrid w:val="0"/>
             </w:pPr>
             <w:r>
               <w:rPr>
@@ -2151,7 +2426,8 @@
           </w:tcPr>
           <w:p>
             <w:pPr>
-              <w:spacing w:after="0"/>
+              <w:spacing w:after="0" w:line="276" w:lineRule="auto" w:before="0"/>
+              <w:snapToGrid w:val="0"/>
             </w:pPr>
             <w:r>
               <w:rPr>
@@ -2169,7 +2445,8 @@
           </w:tcPr>
           <w:p>
             <w:pPr>
-              <w:spacing w:after="0"/>
+              <w:spacing w:after="0" w:line="276" w:lineRule="auto" w:before="0"/>
+              <w:snapToGrid w:val="0"/>
             </w:pPr>
             <w:r>
               <w:rPr>
@@ -2189,13 +2466,16 @@
     </w:p>
     <w:p>
       <w:pPr>
+        <w:pStyle w:val="Heading2"/>
         <w:keepNext/>
+        <w:pageBreakBefore w:val="0"/>
         <w:spacing w:before="140" w:after="120"/>
       </w:pPr>
       <w:r>
         <w:rPr>
           <w:rFonts w:ascii="黑体" w:hAnsi="黑体" w:eastAsia="黑体"/>
           <w:b/>
+          <w:color w:val="000000"/>
           <w:sz w:val="24"/>
         </w:rPr>
         <w:t>3.2 总体架构</w:t>
@@ -2297,13 +2577,16 @@
     </w:tbl>
     <w:p>
       <w:pPr>
+        <w:pStyle w:val="Heading2"/>
         <w:keepNext/>
+        <w:pageBreakBefore w:val="0"/>
         <w:spacing w:before="140" w:after="120"/>
       </w:pPr>
       <w:r>
         <w:rPr>
           <w:rFonts w:ascii="黑体" w:hAnsi="黑体" w:eastAsia="黑体"/>
           <w:b/>
+          <w:color w:val="000000"/>
           <w:sz w:val="24"/>
         </w:rPr>
         <w:t>3.3 功能模块结构</w:t>
@@ -2316,6 +2599,20 @@
         <w:jc w:val="center"/>
         <w:tblLayout w:type="fixed"/>
         <w:tblLook w:firstColumn="1" w:firstRow="1" w:lastColumn="0" w:lastRow="0" w:noHBand="0" w:noVBand="1" w:val="04A0"/>
+        <w:tblBorders>
+          <w:top w:val="single" w:sz="4" w:color="D9D9D9"/>
+          <w:left w:val="single" w:sz="4" w:color="D9D9D9"/>
+          <w:bottom w:val="single" w:sz="4" w:color="D9D9D9"/>
+          <w:right w:val="single" w:sz="4" w:color="D9D9D9"/>
+          <w:insideH w:val="single" w:sz="4" w:color="D9D9D9"/>
+          <w:insideV w:val="single" w:sz="4" w:color="D9D9D9"/>
+        </w:tblBorders>
+        <w:tblCellMar>
+          <w:top w:w="60" w:type="dxa"/>
+          <w:bottom w:w="60" w:type="dxa"/>
+          <w:left w:w="80" w:type="dxa"/>
+          <w:right w:w="80" w:type="dxa"/>
+        </w:tblCellMar>
       </w:tblPr>
       <w:tblGrid>
         <w:gridCol w:w="2946"/>
@@ -2335,7 +2632,9 @@
           </w:tcPr>
           <w:p>
             <w:pPr>
+              <w:spacing w:line="276" w:lineRule="auto" w:before="0" w:after="0"/>
               <w:jc w:val="center"/>
+              <w:snapToGrid w:val="0"/>
             </w:pPr>
             <w:r>
               <w:rPr>
@@ -2355,7 +2654,9 @@
           </w:tcPr>
           <w:p>
             <w:pPr>
+              <w:spacing w:line="276" w:lineRule="auto" w:before="0" w:after="0"/>
               <w:jc w:val="center"/>
+              <w:snapToGrid w:val="0"/>
             </w:pPr>
             <w:r>
               <w:rPr>
@@ -2375,7 +2676,9 @@
           </w:tcPr>
           <w:p>
             <w:pPr>
+              <w:spacing w:line="276" w:lineRule="auto" w:before="0" w:after="0"/>
               <w:jc w:val="center"/>
+              <w:snapToGrid w:val="0"/>
             </w:pPr>
             <w:r>
               <w:rPr>
@@ -2399,7 +2702,8 @@
           </w:tcPr>
           <w:p>
             <w:pPr>
-              <w:spacing w:after="0"/>
+              <w:spacing w:after="0" w:line="276" w:lineRule="auto" w:before="0"/>
+              <w:snapToGrid w:val="0"/>
             </w:pPr>
             <w:r>
               <w:rPr>
@@ -2417,7 +2721,8 @@
           </w:tcPr>
           <w:p>
             <w:pPr>
-              <w:spacing w:after="0"/>
+              <w:spacing w:after="0" w:line="276" w:lineRule="auto" w:before="0"/>
+              <w:snapToGrid w:val="0"/>
             </w:pPr>
             <w:r>
               <w:rPr>
@@ -2435,7 +2740,8 @@
           </w:tcPr>
           <w:p>
             <w:pPr>
-              <w:spacing w:after="0"/>
+              <w:spacing w:after="0" w:line="276" w:lineRule="auto" w:before="0"/>
+              <w:snapToGrid w:val="0"/>
             </w:pPr>
             <w:r>
               <w:rPr>
@@ -2458,7 +2764,8 @@
           </w:tcPr>
           <w:p>
             <w:pPr>
-              <w:spacing w:after="0"/>
+              <w:spacing w:after="0" w:line="276" w:lineRule="auto" w:before="0"/>
+              <w:snapToGrid w:val="0"/>
             </w:pPr>
             <w:r>
               <w:rPr>
@@ -2476,7 +2783,8 @@
           </w:tcPr>
           <w:p>
             <w:pPr>
-              <w:spacing w:after="0"/>
+              <w:spacing w:after="0" w:line="276" w:lineRule="auto" w:before="0"/>
+              <w:snapToGrid w:val="0"/>
             </w:pPr>
             <w:r>
               <w:rPr>
@@ -2494,7 +2802,8 @@
           </w:tcPr>
           <w:p>
             <w:pPr>
-              <w:spacing w:after="0"/>
+              <w:spacing w:after="0" w:line="276" w:lineRule="auto" w:before="0"/>
+              <w:snapToGrid w:val="0"/>
             </w:pPr>
             <w:r>
               <w:rPr>
@@ -2517,7 +2826,8 @@
           </w:tcPr>
           <w:p>
             <w:pPr>
-              <w:spacing w:after="0"/>
+              <w:spacing w:after="0" w:line="276" w:lineRule="auto" w:before="0"/>
+              <w:snapToGrid w:val="0"/>
             </w:pPr>
             <w:r>
               <w:rPr>
@@ -2535,7 +2845,8 @@
           </w:tcPr>
           <w:p>
             <w:pPr>
-              <w:spacing w:after="0"/>
+              <w:spacing w:after="0" w:line="276" w:lineRule="auto" w:before="0"/>
+              <w:snapToGrid w:val="0"/>
             </w:pPr>
             <w:r>
               <w:rPr>
@@ -2553,7 +2864,8 @@
           </w:tcPr>
           <w:p>
             <w:pPr>
-              <w:spacing w:after="0"/>
+              <w:spacing w:after="0" w:line="276" w:lineRule="auto" w:before="0"/>
+              <w:snapToGrid w:val="0"/>
             </w:pPr>
             <w:r>
               <w:rPr>
@@ -2576,7 +2888,8 @@
           </w:tcPr>
           <w:p>
             <w:pPr>
-              <w:spacing w:after="0"/>
+              <w:spacing w:after="0" w:line="276" w:lineRule="auto" w:before="0"/>
+              <w:snapToGrid w:val="0"/>
             </w:pPr>
             <w:r>
               <w:rPr>
@@ -2594,7 +2907,8 @@
           </w:tcPr>
           <w:p>
             <w:pPr>
-              <w:spacing w:after="0"/>
+              <w:spacing w:after="0" w:line="276" w:lineRule="auto" w:before="0"/>
+              <w:snapToGrid w:val="0"/>
             </w:pPr>
             <w:r>
               <w:rPr>
@@ -2612,7 +2926,8 @@
           </w:tcPr>
           <w:p>
             <w:pPr>
-              <w:spacing w:after="0"/>
+              <w:spacing w:after="0" w:line="276" w:lineRule="auto" w:before="0"/>
+              <w:snapToGrid w:val="0"/>
             </w:pPr>
             <w:r>
               <w:rPr>
@@ -2635,7 +2950,8 @@
           </w:tcPr>
           <w:p>
             <w:pPr>
-              <w:spacing w:after="0"/>
+              <w:spacing w:after="0" w:line="276" w:lineRule="auto" w:before="0"/>
+              <w:snapToGrid w:val="0"/>
             </w:pPr>
             <w:r>
               <w:rPr>
@@ -2653,7 +2969,8 @@
           </w:tcPr>
           <w:p>
             <w:pPr>
-              <w:spacing w:after="0"/>
+              <w:spacing w:after="0" w:line="276" w:lineRule="auto" w:before="0"/>
+              <w:snapToGrid w:val="0"/>
             </w:pPr>
             <w:r>
               <w:rPr>
@@ -2671,7 +2988,8 @@
           </w:tcPr>
           <w:p>
             <w:pPr>
-              <w:spacing w:after="0"/>
+              <w:spacing w:after="0" w:line="276" w:lineRule="auto" w:before="0"/>
+              <w:snapToGrid w:val="0"/>
             </w:pPr>
             <w:r>
               <w:rPr>
@@ -2694,7 +3012,132 @@
           </w:tcPr>
           <w:p>
             <w:pPr>
-              <w:spacing w:after="0"/>
+              <w:spacing w:after="0" w:line="276" w:lineRule="auto" w:before="0"/>
+              <w:snapToGrid w:val="0"/>
+            </w:pPr>
+            <w:r>
+              <w:rPr>
+                <w:rFonts w:ascii="宋体" w:hAnsi="宋体" w:eastAsia="宋体"/>
+                <w:sz w:val="19"/>
+              </w:rPr>
+              <w:t>预算与周期记账</w:t>
+            </w:r>
+          </w:p>
+        </w:tc>
+        <w:tc>
+          <w:tcPr>
+            <w:tcW w:type="dxa" w:w="3168"/>
+            <w:vAlign w:val="center"/>
+          </w:tcPr>
+          <w:p>
+            <w:pPr>
+              <w:spacing w:after="0" w:line="276" w:lineRule="auto" w:before="0"/>
+              <w:snapToGrid w:val="0"/>
+            </w:pPr>
+            <w:r>
+              <w:rPr>
+                <w:rFonts w:ascii="宋体" w:hAnsi="宋体" w:eastAsia="宋体"/>
+                <w:sz w:val="19"/>
+              </w:rPr>
+              <w:t>budget、recurring</w:t>
+            </w:r>
+          </w:p>
+        </w:tc>
+        <w:tc>
+          <w:tcPr>
+            <w:tcW w:type="dxa" w:w="3456"/>
+            <w:vAlign w:val="center"/>
+          </w:tcPr>
+          <w:p>
+            <w:pPr>
+              <w:spacing w:after="0" w:line="276" w:lineRule="auto" w:before="0"/>
+              <w:snapToGrid w:val="0"/>
+            </w:pPr>
+            <w:r>
+              <w:rPr>
+                <w:rFonts w:ascii="宋体" w:hAnsi="宋体" w:eastAsia="宋体"/>
+                <w:sz w:val="19"/>
+              </w:rPr>
+              <w:t>budgets、recurring</w:t>
+            </w:r>
+          </w:p>
+        </w:tc>
+      </w:tr>
+      <w:tr>
+        <w:trPr>
+          <w:cantSplit/>
+        </w:trPr>
+        <w:tc>
+          <w:tcPr>
+            <w:tcW w:type="dxa" w:w="1872"/>
+            <w:vAlign w:val="center"/>
+          </w:tcPr>
+          <w:p>
+            <w:pPr>
+              <w:spacing w:after="0" w:line="276" w:lineRule="auto" w:before="0"/>
+              <w:snapToGrid w:val="0"/>
+            </w:pPr>
+            <w:r>
+              <w:rPr>
+                <w:rFonts w:ascii="宋体" w:hAnsi="宋体" w:eastAsia="宋体"/>
+                <w:sz w:val="19"/>
+              </w:rPr>
+              <w:t>CSV 与操作日志</w:t>
+            </w:r>
+          </w:p>
+        </w:tc>
+        <w:tc>
+          <w:tcPr>
+            <w:tcW w:type="dxa" w:w="3168"/>
+            <w:vAlign w:val="center"/>
+          </w:tcPr>
+          <w:p>
+            <w:pPr>
+              <w:spacing w:after="0" w:line="276" w:lineRule="auto" w:before="0"/>
+              <w:snapToGrid w:val="0"/>
+            </w:pPr>
+            <w:r>
+              <w:rPr>
+                <w:rFonts w:ascii="宋体" w:hAnsi="宋体" w:eastAsia="宋体"/>
+                <w:sz w:val="19"/>
+              </w:rPr>
+              <w:t>ledger、audit</w:t>
+            </w:r>
+          </w:p>
+        </w:tc>
+        <w:tc>
+          <w:tcPr>
+            <w:tcW w:type="dxa" w:w="3456"/>
+            <w:vAlign w:val="center"/>
+          </w:tcPr>
+          <w:p>
+            <w:pPr>
+              <w:spacing w:after="0" w:line="276" w:lineRule="auto" w:before="0"/>
+              <w:snapToGrid w:val="0"/>
+            </w:pPr>
+            <w:r>
+              <w:rPr>
+                <w:rFonts w:ascii="宋体" w:hAnsi="宋体" w:eastAsia="宋体"/>
+                <w:sz w:val="19"/>
+              </w:rPr>
+              <w:t>entries 导入导出、audit-logs</w:t>
+            </w:r>
+          </w:p>
+        </w:tc>
+      </w:tr>
+      <w:tr>
+        <w:trPr>
+          <w:cantSplit/>
+        </w:trPr>
+        <w:tc>
+          <w:tcPr>
+            <w:tcW w:type="dxa" w:w="1872"/>
+            <w:vAlign w:val="center"/>
+          </w:tcPr>
+          <w:p>
+            <w:pPr>
+              <w:spacing w:after="0" w:line="276" w:lineRule="auto" w:before="0"/>
+              <w:snapToGrid w:val="0"/>
             </w:pPr>
             <w:r>
               <w:rPr>
@@ -2712,7 +3155,8 @@
           </w:tcPr>
           <w:p>
             <w:pPr>
-              <w:spacing w:after="0"/>
+              <w:spacing w:after="0" w:line="276" w:lineRule="auto" w:before="0"/>
+              <w:snapToGrid w:val="0"/>
             </w:pPr>
             <w:r>
               <w:rPr>
@@ -2730,7 +3174,8 @@
           </w:tcPr>
           <w:p>
             <w:pPr>
-              <w:spacing w:after="0"/>
+              <w:spacing w:after="0" w:line="276" w:lineRule="auto" w:before="0"/>
+              <w:snapToGrid w:val="0"/>
             </w:pPr>
             <w:r>
               <w:rPr>
@@ -2750,13 +3195,16 @@
     </w:p>
     <w:p>
       <w:pPr>
+        <w:pStyle w:val="Heading2"/>
         <w:keepNext/>
+        <w:pageBreakBefore w:val="0"/>
         <w:spacing w:before="140" w:after="120"/>
       </w:pPr>
       <w:r>
         <w:rPr>
           <w:rFonts w:ascii="黑体" w:hAnsi="黑体" w:eastAsia="黑体"/>
           <w:b/>
+          <w:color w:val="000000"/>
           <w:sz w:val="24"/>
         </w:rPr>
         <w:t>3.4 数据库设计</w:t>
@@ -2769,6 +3217,20 @@
         <w:jc w:val="center"/>
         <w:tblLayout w:type="fixed"/>
         <w:tblLook w:firstColumn="1" w:firstRow="1" w:lastColumn="0" w:lastRow="0" w:noHBand="0" w:noVBand="1" w:val="04A0"/>
+        <w:tblBorders>
+          <w:top w:val="single" w:sz="4" w:color="D9D9D9"/>
+          <w:left w:val="single" w:sz="4" w:color="D9D9D9"/>
+          <w:bottom w:val="single" w:sz="4" w:color="D9D9D9"/>
+          <w:right w:val="single" w:sz="4" w:color="D9D9D9"/>
+          <w:insideH w:val="single" w:sz="4" w:color="D9D9D9"/>
+          <w:insideV w:val="single" w:sz="4" w:color="D9D9D9"/>
+        </w:tblBorders>
+        <w:tblCellMar>
+          <w:top w:w="60" w:type="dxa"/>
+          <w:bottom w:w="60" w:type="dxa"/>
+          <w:left w:w="80" w:type="dxa"/>
+          <w:right w:w="80" w:type="dxa"/>
+        </w:tblCellMar>
       </w:tblPr>
       <w:tblGrid>
         <w:gridCol w:w="2946"/>
@@ -2788,7 +3250,9 @@
           </w:tcPr>
           <w:p>
             <w:pPr>
+              <w:spacing w:line="276" w:lineRule="auto" w:before="0" w:after="0"/>
               <w:jc w:val="center"/>
+              <w:snapToGrid w:val="0"/>
             </w:pPr>
             <w:r>
               <w:rPr>
@@ -2808,7 +3272,9 @@
           </w:tcPr>
           <w:p>
             <w:pPr>
+              <w:spacing w:line="276" w:lineRule="auto" w:before="0" w:after="0"/>
               <w:jc w:val="center"/>
+              <w:snapToGrid w:val="0"/>
             </w:pPr>
             <w:r>
               <w:rPr>
@@ -2828,7 +3294,9 @@
           </w:tcPr>
           <w:p>
             <w:pPr>
+              <w:spacing w:line="276" w:lineRule="auto" w:before="0" w:after="0"/>
               <w:jc w:val="center"/>
+              <w:snapToGrid w:val="0"/>
             </w:pPr>
             <w:r>
               <w:rPr>
@@ -2852,7 +3320,8 @@
           </w:tcPr>
           <w:p>
             <w:pPr>
-              <w:spacing w:after="0"/>
+              <w:spacing w:after="0" w:line="276" w:lineRule="auto" w:before="0"/>
+              <w:snapToGrid w:val="0"/>
             </w:pPr>
             <w:r>
               <w:rPr>
@@ -2870,7 +3339,8 @@
           </w:tcPr>
           <w:p>
             <w:pPr>
-              <w:spacing w:after="0"/>
+              <w:spacing w:after="0" w:line="276" w:lineRule="auto" w:before="0"/>
+              <w:snapToGrid w:val="0"/>
             </w:pPr>
             <w:r>
               <w:rPr>
@@ -2888,7 +3358,8 @@
           </w:tcPr>
           <w:p>
             <w:pPr>
-              <w:spacing w:after="0"/>
+              <w:spacing w:after="0" w:line="276" w:lineRule="auto" w:before="0"/>
+              <w:snapToGrid w:val="0"/>
             </w:pPr>
             <w:r>
               <w:rPr>
@@ -2911,7 +3382,8 @@
           </w:tcPr>
           <w:p>
             <w:pPr>
-              <w:spacing w:after="0"/>
+              <w:spacing w:after="0" w:line="276" w:lineRule="auto" w:before="0"/>
+              <w:snapToGrid w:val="0"/>
             </w:pPr>
             <w:r>
               <w:rPr>
@@ -2929,7 +3401,8 @@
           </w:tcPr>
           <w:p>
             <w:pPr>
-              <w:spacing w:after="0"/>
+              <w:spacing w:after="0" w:line="276" w:lineRule="auto" w:before="0"/>
+              <w:snapToGrid w:val="0"/>
             </w:pPr>
             <w:r>
               <w:rPr>
@@ -2947,7 +3420,8 @@
           </w:tcPr>
           <w:p>
             <w:pPr>
-              <w:spacing w:after="0"/>
+              <w:spacing w:after="0" w:line="276" w:lineRule="auto" w:before="0"/>
+              <w:snapToGrid w:val="0"/>
             </w:pPr>
             <w:r>
               <w:rPr>
@@ -2970,7 +3444,8 @@
           </w:tcPr>
           <w:p>
             <w:pPr>
-              <w:spacing w:after="0"/>
+              <w:spacing w:after="0" w:line="276" w:lineRule="auto" w:before="0"/>
+              <w:snapToGrid w:val="0"/>
             </w:pPr>
             <w:r>
               <w:rPr>
@@ -2988,7 +3463,8 @@
           </w:tcPr>
           <w:p>
             <w:pPr>
-              <w:spacing w:after="0"/>
+              <w:spacing w:after="0" w:line="276" w:lineRule="auto" w:before="0"/>
+              <w:snapToGrid w:val="0"/>
             </w:pPr>
             <w:r>
               <w:rPr>
@@ -3006,7 +3482,8 @@
           </w:tcPr>
           <w:p>
             <w:pPr>
-              <w:spacing w:after="0"/>
+              <w:spacing w:after="0" w:line="276" w:lineRule="auto" w:before="0"/>
+              <w:snapToGrid w:val="0"/>
             </w:pPr>
             <w:r>
               <w:rPr>
@@ -3029,7 +3506,8 @@
           </w:tcPr>
           <w:p>
             <w:pPr>
-              <w:spacing w:after="0"/>
+              <w:spacing w:after="0" w:line="276" w:lineRule="auto" w:before="0"/>
+              <w:snapToGrid w:val="0"/>
             </w:pPr>
             <w:r>
               <w:rPr>
@@ -3047,7 +3525,8 @@
           </w:tcPr>
           <w:p>
             <w:pPr>
-              <w:spacing w:after="0"/>
+              <w:spacing w:after="0" w:line="276" w:lineRule="auto" w:before="0"/>
+              <w:snapToGrid w:val="0"/>
             </w:pPr>
             <w:r>
               <w:rPr>
@@ -3065,7 +3544,8 @@
           </w:tcPr>
           <w:p>
             <w:pPr>
-              <w:spacing w:after="0"/>
+              <w:spacing w:after="0" w:line="276" w:lineRule="auto" w:before="0"/>
+              <w:snapToGrid w:val="0"/>
             </w:pPr>
             <w:r>
               <w:rPr>
@@ -3073,6 +3553,254 @@
                 <w:sz w:val="19"/>
               </w:rPr>
               <w:t>金额大于零；外键；家庭/日期索引</w:t>
+            </w:r>
+          </w:p>
+        </w:tc>
+      </w:tr>
+      <w:tr>
+        <w:trPr>
+          <w:cantSplit/>
+        </w:trPr>
+        <w:tc>
+          <w:tcPr>
+            <w:tcW w:type="dxa" w:w="1800"/>
+            <w:vAlign w:val="center"/>
+          </w:tcPr>
+          <w:p>
+            <w:pPr>
+              <w:spacing w:after="0" w:line="276" w:lineRule="auto" w:before="0"/>
+              <w:snapToGrid w:val="0"/>
+            </w:pPr>
+            <w:r>
+              <w:rPr>
+                <w:rFonts w:ascii="宋体" w:hAnsi="宋体" w:eastAsia="宋体"/>
+                <w:sz w:val="19"/>
+              </w:rPr>
+              <w:t>monthly_budget</w:t>
+            </w:r>
+          </w:p>
+        </w:tc>
+        <w:tc>
+          <w:tcPr>
+            <w:tcW w:type="dxa" w:w="3888"/>
+            <w:vAlign w:val="center"/>
+          </w:tcPr>
+          <w:p>
+            <w:pPr>
+              <w:spacing w:after="0" w:line="276" w:lineRule="auto" w:before="0"/>
+              <w:snapToGrid w:val="0"/>
+            </w:pPr>
+            <w:r>
+              <w:rPr>
+                <w:rFonts w:ascii="宋体" w:hAnsi="宋体" w:eastAsia="宋体"/>
+                <w:sz w:val="19"/>
+              </w:rPr>
+              <w:t>家庭、月份、可空分类、金额</w:t>
+            </w:r>
+          </w:p>
+        </w:tc>
+        <w:tc>
+          <w:tcPr>
+            <w:tcW w:type="dxa" w:w="2808"/>
+            <w:vAlign w:val="center"/>
+          </w:tcPr>
+          <w:p>
+            <w:pPr>
+              <w:spacing w:after="0" w:line="276" w:lineRule="auto" w:before="0"/>
+              <w:snapToGrid w:val="0"/>
+            </w:pPr>
+            <w:r>
+              <w:rPr>
+                <w:rFonts w:ascii="宋体" w:hAnsi="宋体" w:eastAsia="宋体"/>
+                <w:sz w:val="19"/>
+              </w:rPr>
+              <w:t>家庭/月份/分类唯一；月份为月首</w:t>
+            </w:r>
+          </w:p>
+        </w:tc>
+      </w:tr>
+      <w:tr>
+        <w:trPr>
+          <w:cantSplit/>
+        </w:trPr>
+        <w:tc>
+          <w:tcPr>
+            <w:tcW w:type="dxa" w:w="1800"/>
+            <w:vAlign w:val="center"/>
+          </w:tcPr>
+          <w:p>
+            <w:pPr>
+              <w:spacing w:after="0" w:line="276" w:lineRule="auto" w:before="0"/>
+              <w:snapToGrid w:val="0"/>
+            </w:pPr>
+            <w:r>
+              <w:rPr>
+                <w:rFonts w:ascii="宋体" w:hAnsi="宋体" w:eastAsia="宋体"/>
+                <w:sz w:val="19"/>
+              </w:rPr>
+              <w:t>recurring_template</w:t>
+            </w:r>
+          </w:p>
+        </w:tc>
+        <w:tc>
+          <w:tcPr>
+            <w:tcW w:type="dxa" w:w="3888"/>
+            <w:vAlign w:val="center"/>
+          </w:tcPr>
+          <w:p>
+            <w:pPr>
+              <w:spacing w:after="0" w:line="276" w:lineRule="auto" w:before="0"/>
+              <w:snapToGrid w:val="0"/>
+            </w:pPr>
+            <w:r>
+              <w:rPr>
+                <w:rFonts w:ascii="宋体" w:hAnsi="宋体" w:eastAsia="宋体"/>
+                <w:sz w:val="19"/>
+              </w:rPr>
+              <w:t>家庭、成员、分类、金额、每月日期、状态</w:t>
+            </w:r>
+          </w:p>
+        </w:tc>
+        <w:tc>
+          <w:tcPr>
+            <w:tcW w:type="dxa" w:w="2808"/>
+            <w:vAlign w:val="center"/>
+          </w:tcPr>
+          <w:p>
+            <w:pPr>
+              <w:spacing w:after="0" w:line="276" w:lineRule="auto" w:before="0"/>
+              <w:snapToGrid w:val="0"/>
+            </w:pPr>
+            <w:r>
+              <w:rPr>
+                <w:rFonts w:ascii="宋体" w:hAnsi="宋体" w:eastAsia="宋体"/>
+                <w:sz w:val="19"/>
+              </w:rPr>
+              <w:t>每月日期 1 至 31；金额大于零</w:t>
+            </w:r>
+          </w:p>
+        </w:tc>
+      </w:tr>
+      <w:tr>
+        <w:trPr>
+          <w:cantSplit/>
+        </w:trPr>
+        <w:tc>
+          <w:tcPr>
+            <w:tcW w:type="dxa" w:w="1800"/>
+            <w:vAlign w:val="center"/>
+          </w:tcPr>
+          <w:p>
+            <w:pPr>
+              <w:spacing w:after="0" w:line="276" w:lineRule="auto" w:before="0"/>
+              <w:snapToGrid w:val="0"/>
+            </w:pPr>
+            <w:r>
+              <w:rPr>
+                <w:rFonts w:ascii="宋体" w:hAnsi="宋体" w:eastAsia="宋体"/>
+                <w:sz w:val="19"/>
+              </w:rPr>
+              <w:t>recurring_generation</w:t>
+            </w:r>
+          </w:p>
+        </w:tc>
+        <w:tc>
+          <w:tcPr>
+            <w:tcW w:type="dxa" w:w="3888"/>
+            <w:vAlign w:val="center"/>
+          </w:tcPr>
+          <w:p>
+            <w:pPr>
+              <w:spacing w:after="0" w:line="276" w:lineRule="auto" w:before="0"/>
+              <w:snapToGrid w:val="0"/>
+            </w:pPr>
+            <w:r>
+              <w:rPr>
+                <w:rFonts w:ascii="宋体" w:hAnsi="宋体" w:eastAsia="宋体"/>
+                <w:sz w:val="19"/>
+              </w:rPr>
+              <w:t>模板、生成月份、流水 ID</w:t>
+            </w:r>
+          </w:p>
+        </w:tc>
+        <w:tc>
+          <w:tcPr>
+            <w:tcW w:type="dxa" w:w="2808"/>
+            <w:vAlign w:val="center"/>
+          </w:tcPr>
+          <w:p>
+            <w:pPr>
+              <w:spacing w:after="0" w:line="276" w:lineRule="auto" w:before="0"/>
+              <w:snapToGrid w:val="0"/>
+            </w:pPr>
+            <w:r>
+              <w:rPr>
+                <w:rFonts w:ascii="宋体" w:hAnsi="宋体" w:eastAsia="宋体"/>
+                <w:sz w:val="19"/>
+              </w:rPr>
+              <w:t>模板/月份唯一，防止重复生成</w:t>
+            </w:r>
+          </w:p>
+        </w:tc>
+      </w:tr>
+      <w:tr>
+        <w:trPr>
+          <w:cantSplit/>
+        </w:trPr>
+        <w:tc>
+          <w:tcPr>
+            <w:tcW w:type="dxa" w:w="1800"/>
+            <w:vAlign w:val="center"/>
+          </w:tcPr>
+          <w:p>
+            <w:pPr>
+              <w:spacing w:after="0" w:line="276" w:lineRule="auto" w:before="0"/>
+              <w:snapToGrid w:val="0"/>
+            </w:pPr>
+            <w:r>
+              <w:rPr>
+                <w:rFonts w:ascii="宋体" w:hAnsi="宋体" w:eastAsia="宋体"/>
+                <w:sz w:val="19"/>
+              </w:rPr>
+              <w:t>audit_log</w:t>
+            </w:r>
+          </w:p>
+        </w:tc>
+        <w:tc>
+          <w:tcPr>
+            <w:tcW w:type="dxa" w:w="3888"/>
+            <w:vAlign w:val="center"/>
+          </w:tcPr>
+          <w:p>
+            <w:pPr>
+              <w:spacing w:after="0" w:line="276" w:lineRule="auto" w:before="0"/>
+              <w:snapToGrid w:val="0"/>
+            </w:pPr>
+            <w:r>
+              <w:rPr>
+                <w:rFonts w:ascii="宋体" w:hAnsi="宋体" w:eastAsia="宋体"/>
+                <w:sz w:val="19"/>
+              </w:rPr>
+              <w:t>家庭、操作者、动作、对象、摘要、时间</w:t>
+            </w:r>
+          </w:p>
+        </w:tc>
+        <w:tc>
+          <w:tcPr>
+            <w:tcW w:type="dxa" w:w="2808"/>
+            <w:vAlign w:val="center"/>
+          </w:tcPr>
+          <w:p>
+            <w:pPr>
+              <w:spacing w:after="0" w:line="276" w:lineRule="auto" w:before="0"/>
+              <w:snapToGrid w:val="0"/>
+            </w:pPr>
+            <w:r>
+              <w:rPr>
+                <w:rFonts w:ascii="宋体" w:hAnsi="宋体" w:eastAsia="宋体"/>
+                <w:sz w:val="19"/>
+              </w:rPr>
+              <w:t>按家庭/时间查询；不记录密码</w:t>
             </w:r>
           </w:p>
         </w:tc>
@@ -3085,13 +3813,16 @@
     </w:p>
     <w:p>
       <w:pPr>
+        <w:pStyle w:val="Heading2"/>
         <w:keepNext/>
+        <w:pageBreakBefore w:val="0"/>
         <w:spacing w:before="140" w:after="120"/>
       </w:pPr>
       <w:r>
         <w:rPr>
           <w:rFonts w:ascii="黑体" w:hAnsi="黑体" w:eastAsia="黑体"/>
           <w:b/>
+          <w:color w:val="000000"/>
           <w:sz w:val="24"/>
         </w:rPr>
         <w:t>3.5 权限、安全与社会责任</w:t>
@@ -3113,19 +3844,17 @@
       </w:r>
     </w:p>
     <w:p>
-      <w:r>
-        <w:br w:type="page"/>
-      </w:r>
-    </w:p>
-    <w:p>
       <w:pPr>
+        <w:pStyle w:val="Heading1"/>
         <w:keepNext/>
+        <w:pageBreakBefore w:val="0"/>
         <w:spacing w:before="200" w:after="120"/>
       </w:pPr>
       <w:r>
         <w:rPr>
           <w:rFonts w:ascii="黑体" w:hAnsi="黑体" w:eastAsia="黑体"/>
           <w:b/>
+          <w:color w:val="000000"/>
           <w:sz w:val="28"/>
         </w:rPr>
         <w:t>四、详细设计</w:t>
@@ -3133,13 +3862,16 @@
     </w:p>
     <w:p>
       <w:pPr>
+        <w:pStyle w:val="Heading2"/>
         <w:keepNext/>
+        <w:pageBreakBefore w:val="0"/>
         <w:spacing w:before="140" w:after="120"/>
       </w:pPr>
       <w:r>
         <w:rPr>
           <w:rFonts w:ascii="黑体" w:hAnsi="黑体" w:eastAsia="黑体"/>
           <w:b/>
+          <w:color w:val="000000"/>
           <w:sz w:val="24"/>
         </w:rPr>
         <w:t>4.1 代码组织与负责文件</w:t>
@@ -3152,6 +3884,20 @@
         <w:jc w:val="center"/>
         <w:tblLayout w:type="fixed"/>
         <w:tblLook w:firstColumn="1" w:firstRow="1" w:lastColumn="0" w:lastRow="0" w:noHBand="0" w:noVBand="1" w:val="04A0"/>
+        <w:tblBorders>
+          <w:top w:val="single" w:sz="4" w:color="D9D9D9"/>
+          <w:left w:val="single" w:sz="4" w:color="D9D9D9"/>
+          <w:bottom w:val="single" w:sz="4" w:color="D9D9D9"/>
+          <w:right w:val="single" w:sz="4" w:color="D9D9D9"/>
+          <w:insideH w:val="single" w:sz="4" w:color="D9D9D9"/>
+          <w:insideV w:val="single" w:sz="4" w:color="D9D9D9"/>
+        </w:tblBorders>
+        <w:tblCellMar>
+          <w:top w:w="60" w:type="dxa"/>
+          <w:bottom w:w="60" w:type="dxa"/>
+          <w:left w:w="80" w:type="dxa"/>
+          <w:right w:w="80" w:type="dxa"/>
+        </w:tblCellMar>
       </w:tblPr>
       <w:tblGrid>
         <w:gridCol w:w="4419"/>
@@ -3170,7 +3916,9 @@
           </w:tcPr>
           <w:p>
             <w:pPr>
+              <w:spacing w:line="276" w:lineRule="auto" w:before="0" w:after="0"/>
               <w:jc w:val="center"/>
+              <w:snapToGrid w:val="0"/>
             </w:pPr>
             <w:r>
               <w:rPr>
@@ -3190,7 +3938,9 @@
           </w:tcPr>
           <w:p>
             <w:pPr>
+              <w:spacing w:line="276" w:lineRule="auto" w:before="0" w:after="0"/>
               <w:jc w:val="center"/>
+              <w:snapToGrid w:val="0"/>
             </w:pPr>
             <w:r>
               <w:rPr>
@@ -3214,7 +3964,8 @@
           </w:tcPr>
           <w:p>
             <w:pPr>
-              <w:spacing w:after="0"/>
+              <w:spacing w:after="0" w:line="276" w:lineRule="auto" w:before="0"/>
+              <w:snapToGrid w:val="0"/>
             </w:pPr>
             <w:r>
               <w:rPr>
@@ -3232,7 +3983,8 @@
           </w:tcPr>
           <w:p>
             <w:pPr>
-              <w:spacing w:after="0"/>
+              <w:spacing w:after="0" w:line="276" w:lineRule="auto" w:before="0"/>
+              <w:snapToGrid w:val="0"/>
             </w:pPr>
             <w:r>
               <w:rPr>
@@ -3255,7 +4007,8 @@
           </w:tcPr>
           <w:p>
             <w:pPr>
-              <w:spacing w:after="0"/>
+              <w:spacing w:after="0" w:line="276" w:lineRule="auto" w:before="0"/>
+              <w:snapToGrid w:val="0"/>
             </w:pPr>
             <w:r>
               <w:rPr>
@@ -3273,7 +4026,8 @@
           </w:tcPr>
           <w:p>
             <w:pPr>
-              <w:spacing w:after="0"/>
+              <w:spacing w:after="0" w:line="276" w:lineRule="auto" w:before="0"/>
+              <w:snapToGrid w:val="0"/>
             </w:pPr>
             <w:r>
               <w:rPr>
@@ -3296,7 +4050,8 @@
           </w:tcPr>
           <w:p>
             <w:pPr>
-              <w:spacing w:after="0"/>
+              <w:spacing w:after="0" w:line="276" w:lineRule="auto" w:before="0"/>
+              <w:snapToGrid w:val="0"/>
             </w:pPr>
             <w:r>
               <w:rPr>
@@ -3314,7 +4069,8 @@
           </w:tcPr>
           <w:p>
             <w:pPr>
-              <w:spacing w:after="0"/>
+              <w:spacing w:after="0" w:line="276" w:lineRule="auto" w:before="0"/>
+              <w:snapToGrid w:val="0"/>
             </w:pPr>
             <w:r>
               <w:rPr>
@@ -3337,7 +4093,8 @@
           </w:tcPr>
           <w:p>
             <w:pPr>
-              <w:spacing w:after="0"/>
+              <w:spacing w:after="0" w:line="276" w:lineRule="auto" w:before="0"/>
+              <w:snapToGrid w:val="0"/>
             </w:pPr>
             <w:r>
               <w:rPr>
@@ -3355,7 +4112,8 @@
           </w:tcPr>
           <w:p>
             <w:pPr>
-              <w:spacing w:after="0"/>
+              <w:spacing w:after="0" w:line="276" w:lineRule="auto" w:before="0"/>
+              <w:snapToGrid w:val="0"/>
             </w:pPr>
             <w:r>
               <w:rPr>
@@ -3378,7 +4136,8 @@
           </w:tcPr>
           <w:p>
             <w:pPr>
-              <w:spacing w:after="0"/>
+              <w:spacing w:after="0" w:line="276" w:lineRule="auto" w:before="0"/>
+              <w:snapToGrid w:val="0"/>
             </w:pPr>
             <w:r>
               <w:rPr>
@@ -3396,14 +4155,15 @@
           </w:tcPr>
           <w:p>
             <w:pPr>
-              <w:spacing w:after="0"/>
+              <w:spacing w:after="0" w:line="276" w:lineRule="auto" w:before="0"/>
+              <w:snapToGrid w:val="0"/>
             </w:pPr>
             <w:r>
               <w:rPr>
                 <w:rFonts w:ascii="宋体" w:hAnsi="宋体" w:eastAsia="宋体"/>
                 <w:sz w:val="19"/>
               </w:rPr>
-              <w:t>resources/db/migration/V1__create_schema.sql、application*.yml</w:t>
+              <w:t>resources/db/migration/V1__create_schema.sql、V2 迁移、application*.yml</w:t>
             </w:r>
           </w:p>
         </w:tc>
@@ -3419,7 +4179,8 @@
           </w:tcPr>
           <w:p>
             <w:pPr>
-              <w:spacing w:after="0"/>
+              <w:spacing w:after="0" w:line="276" w:lineRule="auto" w:before="0"/>
+              <w:snapToGrid w:val="0"/>
             </w:pPr>
             <w:r>
               <w:rPr>
@@ -3437,7 +4198,8 @@
           </w:tcPr>
           <w:p>
             <w:pPr>
-              <w:spacing w:after="0"/>
+              <w:spacing w:after="0" w:line="276" w:lineRule="auto" w:before="0"/>
+              <w:snapToGrid w:val="0"/>
             </w:pPr>
             <w:r>
               <w:rPr>
@@ -3457,13 +4219,16 @@
     </w:p>
     <w:p>
       <w:pPr>
+        <w:pStyle w:val="Heading2"/>
         <w:keepNext/>
+        <w:pageBreakBefore w:val="0"/>
         <w:spacing w:before="140" w:after="120"/>
       </w:pPr>
       <w:r>
         <w:rPr>
           <w:rFonts w:ascii="黑体" w:hAnsi="黑体" w:eastAsia="黑体"/>
           <w:b/>
+          <w:color w:val="000000"/>
           <w:sz w:val="24"/>
         </w:rPr>
         <w:t>4.2 安全链与会话</w:t>
@@ -3481,7 +4246,7 @@
           <w:b w:val="0"/>
           <w:sz w:val="22"/>
         </w:rPr>
-        <w:t>SecurityConfig 禁用默认表单登录和 HTTP Basic，使用 DaoAuthenticationProvider 与 BCrypt。登录成功后保存服务端 Session 并变更 Session ID；CookieCsrfTokenRepository 给浏览器提供 CSRF Token，所有写接口必须携带对应请求头。认证入口返回 401，权限拒绝返回 403 JSON。</w:t>
+        <w:t>SecurityConfig 禁用默认表单登录和 HTTP Basic，使用 DaoAuthenticationProvider 与 BCrypt。登录后保存 SecurityContext；CookieCsrfTokenRepository 给浏览器提供 CSRF Token，写请求按安全链规则校验。未认证访问受保护接口返回 401，权限拒绝返回 403 JSON。会话固定攻击防护配置与自定义登录路径的集成效果需作为安全回归项验证。</w:t>
       </w:r>
     </w:p>
     <w:tbl>
@@ -3557,13 +4322,16 @@
     </w:tbl>
     <w:p>
       <w:pPr>
+        <w:pStyle w:val="Heading2"/>
         <w:keepNext/>
+        <w:pageBreakBefore w:val="0"/>
         <w:spacing w:before="140" w:after="120"/>
       </w:pPr>
       <w:r>
         <w:rPr>
           <w:rFonts w:ascii="黑体" w:hAnsi="黑体" w:eastAsia="黑体"/>
           <w:b/>
+          <w:color w:val="000000"/>
           <w:sz w:val="24"/>
         </w:rPr>
         <w:t>4.3 当前用户与家庭边界</w:t>
@@ -3586,13 +4354,16 @@
     </w:p>
     <w:p>
       <w:pPr>
+        <w:pStyle w:val="Heading2"/>
         <w:keepNext/>
+        <w:pageBreakBefore w:val="0"/>
         <w:spacing w:before="140" w:after="120"/>
       </w:pPr>
       <w:r>
         <w:rPr>
           <w:rFonts w:ascii="黑体" w:hAnsi="黑体" w:eastAsia="黑体"/>
           <w:b/>
+          <w:color w:val="000000"/>
           <w:sz w:val="24"/>
         </w:rPr>
         <w:t>4.4 创建与加入家庭</w:t>
@@ -3613,86 +4384,33 @@
         <w:t>创建家庭在单事务中插入家庭并把创建者设为 M001/PARENT。加入家庭把邀请码转为大写，定位并锁定家庭，复核邀请码仍有效，锁定成员序号后生成下一个编号，最后更新用户家庭与角色。邀请码使用排除易混淆字符的安全随机字符集，数据库唯一索引提供最终冲突保护。</w:t>
       </w:r>
     </w:p>
-    <w:tbl>
-      <w:tblPr>
-        <w:tblStyle w:val="TableGrid"/>
-        <w:tblW w:type="auto" w:w="0"/>
-        <w:jc w:val="center"/>
-        <w:tblLook w:firstColumn="1" w:firstRow="1" w:lastColumn="0" w:lastRow="0" w:noHBand="0" w:noVBand="1" w:val="04A0"/>
-      </w:tblPr>
-      <w:tblGrid>
-        <w:gridCol w:w="8838"/>
-      </w:tblGrid>
-      <w:tr>
-        <w:tc>
-          <w:tcPr>
-            <w:tcW w:type="dxa" w:w="8838"/>
-            <w:shd w:fill="F5F7FA"/>
-          </w:tcPr>
-          <w:p>
-            <w:pPr>
-              <w:spacing w:before="80" w:after="80"/>
-            </w:pPr>
-            <w:r>
-              <w:rPr>
-                <w:rFonts w:ascii="Consolas" w:hAnsi="Consolas" w:eastAsia="宋体"/>
-                <w:sz w:val="17"/>
-              </w:rPr>
-              <w:t>Household household = householdMapper.selectForUpdateById(found.getId());</w:t>
-              <w:br/>
-            </w:r>
-            <w:r>
-              <w:rPr>
-                <w:rFonts w:ascii="Consolas" w:hAnsi="Consolas" w:eastAsia="宋体"/>
-                <w:sz w:val="17"/>
-              </w:rPr>
-              <w:t>int sequence = userMapper.maxMemberSequenceForUpdate(household.getId()) + 1;</w:t>
-              <w:br/>
-            </w:r>
-            <w:r>
-              <w:rPr>
-                <w:rFonts w:ascii="Consolas" w:hAnsi="Consolas" w:eastAsia="宋体"/>
-                <w:sz w:val="17"/>
-              </w:rPr>
-              <w:t>String memberNo = "M" + String.format("%03d", sequence);</w:t>
-              <w:br/>
-            </w:r>
-            <w:r>
-              <w:rPr>
-                <w:rFonts w:ascii="Consolas" w:hAnsi="Consolas" w:eastAsia="宋体"/>
-                <w:sz w:val="17"/>
-              </w:rPr>
-              <w:t>user.setHouseholdId(household.getId());</w:t>
-              <w:br/>
-            </w:r>
-            <w:r>
-              <w:rPr>
-                <w:rFonts w:ascii="Consolas" w:hAnsi="Consolas" w:eastAsia="宋体"/>
-                <w:sz w:val="17"/>
-              </w:rPr>
-              <w:t>user.setMemberNo(memberNo);</w:t>
-              <w:br/>
-            </w:r>
-            <w:r>
-              <w:rPr>
-                <w:rFonts w:ascii="Consolas" w:hAnsi="Consolas" w:eastAsia="宋体"/>
-                <w:sz w:val="17"/>
-              </w:rPr>
-              <w:t>user.setRole(Role.MEMBER);</w:t>
-            </w:r>
-          </w:p>
-        </w:tc>
-      </w:tr>
-    </w:tbl>
     <w:p>
       <w:pPr>
+        <w:spacing w:line="360" w:lineRule="auto" w:after="80"/>
+        <w:ind w:firstLine="440"/>
+        <w:jc w:val="both"/>
+      </w:pPr>
+      <w:r>
+        <w:rPr>
+          <w:rFonts w:ascii="宋体" w:hAnsi="宋体" w:eastAsia="宋体"/>
+          <w:b w:val="0"/>
+          <w:sz w:val="22"/>
+        </w:rPr>
+        <w:t>实现位置：household/service/HouseholdService.java。加入家庭的事务处理应与家庭锁、成员编号唯一约束一起理解，不能只依赖前端禁用按钮保证并发安全。</w:t>
+      </w:r>
+    </w:p>
+    <w:p>
+      <w:pPr>
+        <w:pStyle w:val="Heading2"/>
         <w:keepNext/>
+        <w:pageBreakBefore w:val="0"/>
         <w:spacing w:before="140" w:after="120"/>
       </w:pPr>
       <w:r>
         <w:rPr>
           <w:rFonts w:ascii="黑体" w:hAnsi="黑体" w:eastAsia="黑体"/>
           <w:b/>
+          <w:color w:val="000000"/>
           <w:sz w:val="24"/>
         </w:rPr>
         <w:t>4.5 数据库与错误模型</w:t>
@@ -3710,18 +4428,21 @@
           <w:b w:val="0"/>
           <w:sz w:val="22"/>
         </w:rPr>
-        <w:t>Flyway V1 迁移建立四表、外键、检查约束和组合索引。业务异常使用稳定 code、中文 message 和可选 fieldErrors，Controller 统一返回真实 HTTP 状态。数据库约束负责最终一致性，服务层负责给用户可理解的错误。</w:t>
+        <w:t>Flyway V1 建立家庭、用户、分类、流水四表，V2 增加月度预算、周期模板、生成记录和审计日志四表。周期生成以模板与月份组合唯一，预算以家庭、月份和分类唯一。业务异常使用稳定 code、中文 message 和可选 fieldErrors，接口返回真实 HTTP 状态。</w:t>
       </w:r>
     </w:p>
     <w:p>
       <w:pPr>
+        <w:pStyle w:val="Heading2"/>
         <w:keepNext/>
+        <w:pageBreakBefore w:val="0"/>
         <w:spacing w:before="140" w:after="120"/>
       </w:pPr>
       <w:r>
         <w:rPr>
           <w:rFonts w:ascii="黑体" w:hAnsi="黑体" w:eastAsia="黑体"/>
           <w:b/>
+          <w:color w:val="000000"/>
           <w:sz w:val="24"/>
         </w:rPr>
         <w:t>4.6 测试与集成</w:t>
@@ -3739,23 +4460,21 @@
           <w:b w:val="0"/>
           <w:sz w:val="22"/>
         </w:rPr>
-        <w:t>认证测试覆盖注册冲突和密码摘要；迁移测试验证空库建表；最终集成验证 Session、CSRF、家庭创建/加入、停用账号旧会话失效、邀请码并发保护和跨家庭隔离。组长还负责对齐前后端 DTO，执行 Maven、前端类型检查、单元测试、生产构建和真实浏览器流程。</w:t>
-      </w:r>
-    </w:p>
-    <w:p>
-      <w:r>
-        <w:br w:type="page"/>
+        <w:t>已记录后端 clean verify、前端测试与生产构建证据，V1/V2 在隔离 MySQL 8.4 库验证通过。API 冒烟覆盖认证、业务查询、新增与清理、预算、周期模板和 CSV 链路。测试次数不等于所有场景覆盖；邀请码并发、会话固定防护和各浏览器文件落盘仍需按专项用例验证。</w:t>
       </w:r>
     </w:p>
     <w:p>
       <w:pPr>
+        <w:pStyle w:val="Heading1"/>
         <w:keepNext/>
+        <w:pageBreakBefore w:val="0"/>
         <w:spacing w:before="200" w:after="120"/>
       </w:pPr>
       <w:r>
         <w:rPr>
           <w:rFonts w:ascii="黑体" w:hAnsi="黑体" w:eastAsia="黑体"/>
           <w:b/>
+          <w:color w:val="000000"/>
           <w:sz w:val="28"/>
         </w:rPr>
         <w:t>五、设计结果</w:t>
@@ -3773,7 +4492,7 @@
           <w:b w:val="0"/>
           <w:sz w:val="22"/>
         </w:rPr>
-        <w:t>以下界面来自当前本机运行的最终系统，使用演示家庭数据获取；截图不含密码、Cookie、Token 或私人浏览器信息。</w:t>
+        <w:t>以下为 2026 年 9 月 6 日从本地运行系统采集的真实视口截图，长页面仅展示局部。登录截图清空凭据，业务截图中的成员及流水使用演示家庭数据。</w:t>
       </w:r>
     </w:p>
     <w:p>
@@ -3784,8 +4503,8 @@
       <w:r>
         <w:drawing>
           <wp:inline xmlns:a="http://schemas.openxmlformats.org/drawingml/2006/main" xmlns:pic="http://schemas.openxmlformats.org/drawingml/2006/picture">
-            <wp:extent cx="5394960" cy="3429707"/>
-            <wp:docPr id="1" name="Picture 1"/>
+            <wp:extent cx="5394960" cy="3034665"/>
+            <wp:docPr id="1" name="Picture 1" descr="图 5-1 登录页：未输入账号密码的真实系统界面"/>
             <wp:cNvGraphicFramePr>
               <a:graphicFrameLocks noChangeAspect="1"/>
             </wp:cNvGraphicFramePr>
@@ -3805,7 +4524,7 @@
                   <pic:spPr>
                     <a:xfrm>
                       <a:off x="0" y="0"/>
-                      <a:ext cx="5394960" cy="3429707"/>
+                      <a:ext cx="5394960" cy="3034665"/>
                     </a:xfrm>
                     <a:prstGeom prst="rect"/>
                   </pic:spPr>
@@ -3837,8 +4556,8 @@
       <w:r>
         <w:drawing>
           <wp:inline xmlns:a="http://schemas.openxmlformats.org/drawingml/2006/main" xmlns:pic="http://schemas.openxmlformats.org/drawingml/2006/picture">
-            <wp:extent cx="5394960" cy="3429707"/>
-            <wp:docPr id="2" name="Picture 2"/>
+            <wp:extent cx="5394960" cy="3036531"/>
+            <wp:docPr id="2" name="Picture 2" descr="图 5-2 家庭成员与家庭通行证：家长可查看邀请码和维护成员"/>
             <wp:cNvGraphicFramePr>
               <a:graphicFrameLocks noChangeAspect="1"/>
             </wp:cNvGraphicFramePr>
@@ -3858,7 +4577,7 @@
                   <pic:spPr>
                     <a:xfrm>
                       <a:off x="0" y="0"/>
-                      <a:ext cx="5394960" cy="3429707"/>
+                      <a:ext cx="5394960" cy="3036531"/>
                     </a:xfrm>
                     <a:prstGeom prst="rect"/>
                   </pic:spPr>
@@ -3883,11 +4602,6 @@
       </w:r>
     </w:p>
     <w:p>
-      <w:r>
-        <w:br w:type="page"/>
-      </w:r>
-    </w:p>
-    <w:p>
       <w:pPr>
         <w:keepNext/>
         <w:jc w:val="center"/>
@@ -3895,8 +4609,8 @@
       <w:r>
         <w:drawing>
           <wp:inline xmlns:a="http://schemas.openxmlformats.org/drawingml/2006/main" xmlns:pic="http://schemas.openxmlformats.org/drawingml/2006/picture">
-            <wp:extent cx="5394960" cy="3429707"/>
-            <wp:docPr id="3" name="Picture 3"/>
+            <wp:extent cx="5394960" cy="3034665"/>
+            <wp:docPr id="3" name="Picture 3" descr="图 5-3 个人资料与修改密码：密码更新后要求重新登录"/>
             <wp:cNvGraphicFramePr>
               <a:graphicFrameLocks noChangeAspect="1"/>
             </wp:cNvGraphicFramePr>
@@ -3916,7 +4630,7 @@
                   <pic:spPr>
                     <a:xfrm>
                       <a:off x="0" y="0"/>
-                      <a:ext cx="5394960" cy="3429707"/>
+                      <a:ext cx="5394960" cy="3034665"/>
                     </a:xfrm>
                     <a:prstGeom prst="rect"/>
                   </pic:spPr>
@@ -3943,12 +4657,68 @@
     <w:p>
       <w:pPr>
         <w:keepNext/>
+        <w:jc w:val="center"/>
+      </w:pPr>
+      <w:r>
+        <w:drawing>
+          <wp:inline xmlns:a="http://schemas.openxmlformats.org/drawingml/2006/main" xmlns:pic="http://schemas.openxmlformats.org/drawingml/2006/picture">
+            <wp:extent cx="5394960" cy="3036531"/>
+            <wp:docPr id="4" name="Picture 4" descr="图 5-4 操作日志：家长查看家庭业务变更记录"/>
+            <wp:cNvGraphicFramePr>
+              <a:graphicFrameLocks noChangeAspect="1"/>
+            </wp:cNvGraphicFramePr>
+            <a:graphic>
+              <a:graphicData uri="http://schemas.openxmlformats.org/drawingml/2006/picture">
+                <pic:pic>
+                  <pic:nvPicPr>
+                    <pic:cNvPr id="0" name="09-audit.png"/>
+                    <pic:cNvPicPr/>
+                  </pic:nvPicPr>
+                  <pic:blipFill>
+                    <a:blip r:embed="rId13"/>
+                    <a:stretch>
+                      <a:fillRect/>
+                    </a:stretch>
+                  </pic:blipFill>
+                  <pic:spPr>
+                    <a:xfrm>
+                      <a:off x="0" y="0"/>
+                      <a:ext cx="5394960" cy="3036531"/>
+                    </a:xfrm>
+                    <a:prstGeom prst="rect"/>
+                  </pic:spPr>
+                </pic:pic>
+              </a:graphicData>
+            </a:graphic>
+          </wp:inline>
+        </w:drawing>
+      </w:r>
+    </w:p>
+    <w:p>
+      <w:pPr>
+        <w:spacing w:after="160"/>
+        <w:jc w:val="center"/>
+      </w:pPr>
+      <w:r>
+        <w:rPr>
+          <w:rFonts w:ascii="宋体" w:hAnsi="宋体" w:eastAsia="宋体"/>
+          <w:sz w:val="20"/>
+        </w:rPr>
+        <w:t>图 5-4 操作日志：家长查看家庭业务变更记录</w:t>
+      </w:r>
+    </w:p>
+    <w:p>
+      <w:pPr>
+        <w:pStyle w:val="Heading2"/>
+        <w:keepNext/>
+        <w:pageBreakBefore w:val="0"/>
         <w:spacing w:before="140" w:after="120"/>
       </w:pPr>
       <w:r>
         <w:rPr>
           <w:rFonts w:ascii="黑体" w:hAnsi="黑体" w:eastAsia="黑体"/>
           <w:b/>
+          <w:color w:val="000000"/>
           <w:sz w:val="24"/>
         </w:rPr>
         <w:t>5.1 结果说明</w:t>
@@ -3970,19 +4740,17 @@
       </w:r>
     </w:p>
     <w:p>
-      <w:r>
-        <w:br w:type="page"/>
-      </w:r>
-    </w:p>
-    <w:p>
       <w:pPr>
+        <w:pStyle w:val="Heading1"/>
         <w:keepNext/>
+        <w:pageBreakBefore w:val="0"/>
         <w:spacing w:before="200" w:after="120"/>
       </w:pPr>
       <w:r>
         <w:rPr>
           <w:rFonts w:ascii="黑体" w:hAnsi="黑体" w:eastAsia="黑体"/>
           <w:b/>
+          <w:color w:val="000000"/>
           <w:sz w:val="28"/>
         </w:rPr>
         <w:t>设计总结</w:t>
@@ -4000,18 +4768,21 @@
           <w:b w:val="0"/>
           <w:sz w:val="22"/>
         </w:rPr>
-        <w:t>在本项目中，我负责将任务书约束落实为可运行的整体方案，重点完成数据库、安全认证、家庭入户和集成验收。最需要谨慎处理的是身份与家庭边界：后端不能相信前端提交的家庭标识，所有业务必须从 Session 当前用户推导家庭范围；邀请码加入还需要在事务中锁定家庭和成员编号序列。通过统一异常模型、数据库约束和服务层校验，系统能够稳定区分 401、403、业务冲突和输入错误。后续可改进之处是进一步补充报告截图标注和测试覆盖说明，但不扩展预算、通知或公网部署等课设范围外功能。</w:t>
+        <w:t>本报告围绕需求落地、数据库、安全认证、家庭入户与集成验证展开。最需要谨慎处理的是身份与家庭边界：后端不能相信前端提交的家庭标识，所有业务必须从 Session 当前用户推导家庭范围；邀请码加入还需要在事务中锁定家庭和成员编号序列。通过统一异常模型、数据库约束和服务层校验，系统能够稳定区分 401、403、业务冲突和输入错误。新增预算、周期记账和审计后，数据库由四张扩展为八张业务表。后续重点是完善边界回归和下载文件验收；通知与公网部署仍不属于当前交付。</w:t>
       </w:r>
     </w:p>
     <w:p>
       <w:pPr>
+        <w:pStyle w:val="Heading2"/>
         <w:keepNext/>
+        <w:pageBreakBefore w:val="0"/>
         <w:spacing w:before="140" w:after="120"/>
       </w:pPr>
       <w:r>
         <w:rPr>
           <w:rFonts w:ascii="黑体" w:hAnsi="黑体" w:eastAsia="黑体"/>
           <w:b/>
+          <w:color w:val="000000"/>
           <w:sz w:val="24"/>
         </w:rPr>
         <w:t>存在问题与改进方向</w:t>
@@ -4029,7 +4800,39 @@
           <w:b w:val="0"/>
           <w:sz w:val="22"/>
         </w:rPr>
-        <w:t>当前系统定位为本机课程设计，不包含多家庭、预算、通知、附件、导入导出、银行同步和公网部署。前端生产构建存在 ECharts/Element Plus 合并包体积 warning，但不影响演示。后续若课程要求变化，应先更新需求文档和验收标准，再决定是否扩展；不应为展示复杂度而提前引入微服务、缓存或消息队列。</w:t>
+        <w:t>当前系统已经包含预算、CSV 导入导出、周期记账、统计增强与审计；仍不包含多家庭切换、附件、通知、银行同步和公网部署。浏览器下载文件落盘与内容核对尚缺独立留证，不能仅凭 Toast 声称下载完成。后续优先补足边界回归、不同浏览器兼容性和辅助技术检查，不将课程系统宣传为真实资金管理或投资建议工具。</w:t>
+      </w:r>
+    </w:p>
+    <w:p>
+      <w:pPr>
+        <w:pStyle w:val="Heading2"/>
+        <w:keepNext/>
+        <w:pageBreakBefore w:val="0"/>
+        <w:spacing w:before="140" w:after="120"/>
+      </w:pPr>
+      <w:r>
+        <w:rPr>
+          <w:rFonts w:ascii="黑体" w:hAnsi="黑体" w:eastAsia="黑体"/>
+          <w:b/>
+          <w:color w:val="000000"/>
+          <w:sz w:val="24"/>
+        </w:rPr>
+        <w:t>版本与验证依据</w:t>
+      </w:r>
+    </w:p>
+    <w:p>
+      <w:pPr>
+        <w:spacing w:line="360" w:lineRule="auto" w:after="80"/>
+        <w:ind w:firstLine="440"/>
+        <w:jc w:val="both"/>
+      </w:pPr>
+      <w:r>
+        <w:rPr>
+          <w:rFonts w:ascii="宋体" w:hAnsi="宋体" w:eastAsia="宋体"/>
+          <w:b w:val="0"/>
+          <w:sz w:val="22"/>
+        </w:rPr>
+        <w:t>材料更新日期：2026 年 9 月 6 日。功能扩展对应提交 6ac2e4b，CSV 前端调整对应 179f4ac，另包含当前工作区登录页视觉更新。此前后端 clean verify 为 18 个测试、0 失败，前端为 25 个测试并通过类型检查与构建；完整命令、历史记录及剩余验收项见 docs/stages/05-测试验收与报告素材.md。上述结果不是本次文档更新重新运行的全量测试。</w:t>
       </w:r>
     </w:p>
     <w:sectPr>

</xml_diff>